<commit_message>
docs: incorporar secciones formales de teoria IO51 (alcance, plan de cuadros, modelo de datos) y exportar word definitivo
</commit_message>
<xml_diff>
--- a/MODELO_CONCEPTUAL_G08.docx
+++ b/MODELO_CONCEPTUAL_G08.docx
@@ -169,7 +169,7 @@
                 <w:b/>
                 <w:sz w:val="18"/>
               </w:rPr>
-              <w:t>Dataset Asignado:</w:t>
+              <w:t>Integrantes:</w:t>
             </w:r>
           </w:p>
         </w:tc>
@@ -188,7 +188,7 @@
               <w:rPr>
                 <w:sz w:val="18"/>
               </w:rPr>
-              <w:t>data/PuertoSur_escalas_G08.csv (8.852 escalas históricas registradas)</w:t>
+              <w:t>Bautista Fanelli, Santiago Montiel, Benjamín ...</w:t>
             </w:r>
           </w:p>
         </w:tc>
@@ -211,7 +211,7 @@
                 <w:b/>
                 <w:sz w:val="18"/>
               </w:rPr>
-              <w:t>Metodología:</w:t>
+              <w:t>Dataset Asignado:</w:t>
             </w:r>
           </w:p>
         </w:tc>
@@ -231,7 +231,7 @@
               <w:rPr>
                 <w:sz w:val="18"/>
               </w:rPr>
-              <w:t>Simulación de Eventos Discretos (DES) &amp; Modelado IDEF0</w:t>
+              <w:t>data/PuertoSur_escalas_G08.csv (8.852 escalas históricas registradas)</w:t>
             </w:r>
           </w:p>
         </w:tc>
@@ -253,7 +253,7 @@
                 <w:b/>
                 <w:sz w:val="18"/>
               </w:rPr>
-              <w:t>Repositorio Oficial:</w:t>
+              <w:t>Metodología:</w:t>
             </w:r>
           </w:p>
         </w:tc>
@@ -272,7 +272,7 @@
               <w:rPr>
                 <w:sz w:val="18"/>
               </w:rPr>
-              <w:t>https://github.com/Santim1897/TP2-IO</w:t>
+              <w:t>Simulación de Eventos Discretos (DES) &amp; Modelado IDEF0</w:t>
             </w:r>
           </w:p>
         </w:tc>
@@ -295,6 +295,48 @@
                 <w:b/>
                 <w:sz w:val="18"/>
               </w:rPr>
+              <w:t>Repositorio Oficial:</w:t>
+            </w:r>
+          </w:p>
+        </w:tc>
+        <w:tc>
+          <w:tcPr>
+            <w:tcW w:type="dxa" w:w="4680"/>
+            <w:shd w:fill="F2F5F9"/>
+            <w:tcMar>
+              <w:top w:w="60" w:type="dxa"/>
+              <w:bottom w:w="60" w:type="dxa"/>
+              <w:left w:w="100" w:type="dxa"/>
+              <w:right w:w="100" w:type="dxa"/>
+            </w:tcMar>
+          </w:tcPr>
+          <w:p>
+            <w:r>
+              <w:rPr>
+                <w:sz w:val="18"/>
+              </w:rPr>
+              <w:t>https://github.com/Santim1897/TP2-IO</w:t>
+            </w:r>
+          </w:p>
+        </w:tc>
+      </w:tr>
+      <w:tr>
+        <w:tc>
+          <w:tcPr>
+            <w:tcW w:type="dxa" w:w="4680"/>
+            <w:tcMar>
+              <w:top w:w="60" w:type="dxa"/>
+              <w:bottom w:w="60" w:type="dxa"/>
+              <w:left w:w="100" w:type="dxa"/>
+              <w:right w:w="100" w:type="dxa"/>
+            </w:tcMar>
+          </w:tcPr>
+          <w:p>
+            <w:r>
+              <w:rPr>
+                <w:b/>
+                <w:sz w:val="18"/>
+              </w:rPr>
               <w:t>Entregable:</w:t>
             </w:r>
           </w:p>
@@ -302,7 +344,6 @@
         <w:tc>
           <w:tcPr>
             <w:tcW w:type="dxa" w:w="4680"/>
-            <w:shd w:fill="F2F5F9"/>
             <w:tcMar>
               <w:top w:w="60" w:type="dxa"/>
               <w:bottom w:w="60" w:type="dxa"/>
@@ -361,6 +402,54 @@
     <w:p>
       <w:r>
         <w:t>Modelar conceptual y computacionalmente el comportamiento estocástico y dinámico del puerto mediante Simulación de Eventos Discretos (DES), cuantificando los tiempos de espera en rada (Wq), maniobras náuticas conjuntas (U(1, 2) h en total), espera de grúas amarrado y faena efectiva en berma; contrastar la operación actual con modelos teóricos de líneas de espera (M/M/c y M/G/c); identificar los cuellos de botella en muelle y patio; y sustentar con evidencia estadística la toma de decisiones estratégicas (adición de una 4ª grúa pórtico STS, políticas de patio y camiones, incorporación de temporada de cruceros y viabilidad de una 4ª berma).</w:t>
+      </w:r>
+    </w:p>
+    <w:p>
+      <w:r>
+        <w:rPr>
+          <w:b/>
+        </w:rPr>
+        <w:t>1.3. Alcance y Supuestos Simplificatorios del Modelo (Diaps. 4 y 21):</w:t>
+      </w:r>
+    </w:p>
+    <w:p>
+      <w:r>
+        <w:t>Conforme a la metodología formal de modelado conceptual de la cátedra (orientada a responder ¿Qué? ¿Por qué? ¿Dónde? ¿Cuándo? ¿Quién? ¿Cuánto?):</w:t>
+      </w:r>
+    </w:p>
+    <w:p>
+      <w:r>
+        <w:t>• ¿Qué? (Objeto de modelado): Operación integral del muelle y frente de atraque, asignación dinámica de grúas pórtico STS, patio de almacenamiento de contenedores y maniobras náuticas de prácticos y remolcadores.</w:t>
+      </w:r>
+    </w:p>
+    <w:p>
+      <w:r>
+        <w:t>• ¿Por qué? (Propósito): Diagnosticar los cuellos de botella que amenazan el umbral contractual de 16 horas de estadía promedio (W &lt;= 16 h) y fundamentar cuantitativamente decisiones estratégicas de expansión física (4ª berma, 4ª grúa, políticas de camiones y cruceros).</w:t>
+      </w:r>
+    </w:p>
+    <w:p>
+      <w:r>
+        <w:t>• ¿Dónde? (Límites espaciales): Desde el área de fondeo en rada exterior hasta el muelle de transferencia y la puerta de salida terrestre de camiones externos (terminal gate).</w:t>
+      </w:r>
+    </w:p>
+    <w:p>
+      <w:r>
+        <w:t>• ¿Cuándo? (Horizonte temporal): Simulación continua de 3 años de operación (8.852 escalas históricas de G08), considerando estacionalidad frutícola y ciclos diarios de 3 turnos de 8 horas.</w:t>
+      </w:r>
+    </w:p>
+    <w:p>
+      <w:r>
+        <w:t>• ¿Quién? (Actores): Buques feeder de 3 servicios regulares, buques de crucero turístico, camiones de transporte terrestre, prácticos náuticos y operarios de estiba.</w:t>
+      </w:r>
+    </w:p>
+    <w:p>
+      <w:r>
+        <w:t>• ¿Cuánto? (Nivel de detalle): Modelado discreto a nivel de buque individual, grúa pórtico y slot de patio, agregando contenedores por tipo (Dry, Reefer, OOG).</w:t>
+      </w:r>
+    </w:p>
+    <w:p>
+      <w:r>
+        <w:t>Supuestos fundamentales: 1) Maniobras náuticas de 1 a 2 horas en conjunto por buque (media 1.5h total); 2) Máximo 2 grúas por buque con interferencia dual del 85%; 3) Balance de patio 50% import / 50% export; 4) Permanencia media en patio de 72h con 20-30% de camiones tardíos.</w:t>
       </w:r>
     </w:p>
     <w:p>
@@ -519,6 +608,1371 @@
       </w:r>
     </w:p>
     <w:p>
+      <w:r>
+        <w:rPr>
+          <w:b/>
+        </w:rPr>
+        <w:t>2.4. Tabla Formal del Modelo de Datos Cuantificado (Diapositiva 19):</w:t>
+      </w:r>
+    </w:p>
+    <w:tbl>
+      <w:tblPr>
+        <w:tblW w:type="auto" w:w="0"/>
+        <w:jc w:val="center"/>
+        <w:tblLook w:firstColumn="1" w:firstRow="1" w:lastColumn="0" w:lastRow="0" w:noHBand="0" w:noVBand="1" w:val="04A0"/>
+      </w:tblPr>
+      <w:tblGrid>
+        <w:gridCol w:w="1560"/>
+        <w:gridCol w:w="1560"/>
+        <w:gridCol w:w="1560"/>
+        <w:gridCol w:w="1560"/>
+        <w:gridCol w:w="1560"/>
+        <w:gridCol w:w="1560"/>
+      </w:tblGrid>
+      <w:tr>
+        <w:tc>
+          <w:tcPr>
+            <w:tcW w:type="dxa" w:w="1560"/>
+            <w:shd w:fill="1F4E79"/>
+            <w:tcMar>
+              <w:top w:w="100" w:type="dxa"/>
+              <w:bottom w:w="100" w:type="dxa"/>
+              <w:left w:w="120" w:type="dxa"/>
+              <w:right w:w="120" w:type="dxa"/>
+            </w:tcMar>
+          </w:tcPr>
+          <w:p>
+            <w:pPr>
+              <w:jc w:val="center"/>
+            </w:pPr>
+            <w:r>
+              <w:rPr>
+                <w:b/>
+                <w:color w:val="FFFFFF"/>
+                <w:sz w:val="19"/>
+              </w:rPr>
+              <w:t>Variable</w:t>
+            </w:r>
+          </w:p>
+        </w:tc>
+        <w:tc>
+          <w:tcPr>
+            <w:tcW w:type="dxa" w:w="1560"/>
+            <w:shd w:fill="1F4E79"/>
+            <w:tcMar>
+              <w:top w:w="100" w:type="dxa"/>
+              <w:bottom w:w="100" w:type="dxa"/>
+              <w:left w:w="120" w:type="dxa"/>
+              <w:right w:w="120" w:type="dxa"/>
+            </w:tcMar>
+          </w:tcPr>
+          <w:p>
+            <w:pPr>
+              <w:jc w:val="center"/>
+            </w:pPr>
+            <w:r>
+              <w:rPr>
+                <w:b/>
+                <w:color w:val="FFFFFF"/>
+                <w:sz w:val="19"/>
+              </w:rPr>
+              <w:t>Descripción</w:t>
+            </w:r>
+          </w:p>
+        </w:tc>
+        <w:tc>
+          <w:tcPr>
+            <w:tcW w:type="dxa" w:w="1560"/>
+            <w:shd w:fill="1F4E79"/>
+            <w:tcMar>
+              <w:top w:w="100" w:type="dxa"/>
+              <w:bottom w:w="100" w:type="dxa"/>
+              <w:left w:w="120" w:type="dxa"/>
+              <w:right w:w="120" w:type="dxa"/>
+            </w:tcMar>
+          </w:tcPr>
+          <w:p>
+            <w:pPr>
+              <w:jc w:val="center"/>
+            </w:pPr>
+            <w:r>
+              <w:rPr>
+                <w:b/>
+                <w:color w:val="FFFFFF"/>
+                <w:sz w:val="19"/>
+              </w:rPr>
+              <w:t>U.M.</w:t>
+            </w:r>
+          </w:p>
+        </w:tc>
+        <w:tc>
+          <w:tcPr>
+            <w:tcW w:type="dxa" w:w="1560"/>
+            <w:shd w:fill="1F4E79"/>
+            <w:tcMar>
+              <w:top w:w="100" w:type="dxa"/>
+              <w:bottom w:w="100" w:type="dxa"/>
+              <w:left w:w="120" w:type="dxa"/>
+              <w:right w:w="120" w:type="dxa"/>
+            </w:tcMar>
+          </w:tcPr>
+          <w:p>
+            <w:pPr>
+              <w:jc w:val="center"/>
+            </w:pPr>
+            <w:r>
+              <w:rPr>
+                <w:b/>
+                <w:color w:val="FFFFFF"/>
+                <w:sz w:val="19"/>
+              </w:rPr>
+              <w:t>Valor / Rango</w:t>
+            </w:r>
+          </w:p>
+        </w:tc>
+        <w:tc>
+          <w:tcPr>
+            <w:tcW w:type="dxa" w:w="1560"/>
+            <w:shd w:fill="1F4E79"/>
+            <w:tcMar>
+              <w:top w:w="100" w:type="dxa"/>
+              <w:bottom w:w="100" w:type="dxa"/>
+              <w:left w:w="120" w:type="dxa"/>
+              <w:right w:w="120" w:type="dxa"/>
+            </w:tcMar>
+          </w:tcPr>
+          <w:p>
+            <w:pPr>
+              <w:jc w:val="center"/>
+            </w:pPr>
+            <w:r>
+              <w:rPr>
+                <w:b/>
+                <w:color w:val="FFFFFF"/>
+                <w:sz w:val="19"/>
+              </w:rPr>
+              <w:t>Relación / Expresión</w:t>
+            </w:r>
+          </w:p>
+        </w:tc>
+        <w:tc>
+          <w:tcPr>
+            <w:tcW w:type="dxa" w:w="1560"/>
+            <w:shd w:fill="1F4E79"/>
+            <w:tcMar>
+              <w:top w:w="100" w:type="dxa"/>
+              <w:bottom w:w="100" w:type="dxa"/>
+              <w:left w:w="120" w:type="dxa"/>
+              <w:right w:w="120" w:type="dxa"/>
+            </w:tcMar>
+          </w:tcPr>
+          <w:p>
+            <w:pPr>
+              <w:jc w:val="center"/>
+            </w:pPr>
+            <w:r>
+              <w:rPr>
+                <w:b/>
+                <w:color w:val="FFFFFF"/>
+                <w:sz w:val="19"/>
+              </w:rPr>
+              <w:t>Característica</w:t>
+            </w:r>
+          </w:p>
+        </w:tc>
+      </w:tr>
+      <w:tr>
+        <w:tc>
+          <w:tcPr>
+            <w:tcW w:type="dxa" w:w="1560"/>
+            <w:shd w:fill="F2F5F9"/>
+            <w:tcMar>
+              <w:top w:w="60" w:type="dxa"/>
+              <w:bottom w:w="60" w:type="dxa"/>
+              <w:left w:w="100" w:type="dxa"/>
+              <w:right w:w="100" w:type="dxa"/>
+            </w:tcMar>
+          </w:tcPr>
+          <w:p>
+            <w:r>
+              <w:rPr>
+                <w:sz w:val="18"/>
+              </w:rPr>
+              <w:t>lambda</w:t>
+            </w:r>
+          </w:p>
+        </w:tc>
+        <w:tc>
+          <w:tcPr>
+            <w:tcW w:type="dxa" w:w="1560"/>
+            <w:shd w:fill="F2F5F9"/>
+            <w:tcMar>
+              <w:top w:w="60" w:type="dxa"/>
+              <w:bottom w:w="60" w:type="dxa"/>
+              <w:left w:w="100" w:type="dxa"/>
+              <w:right w:w="100" w:type="dxa"/>
+            </w:tcMar>
+          </w:tcPr>
+          <w:p>
+            <w:r>
+              <w:rPr>
+                <w:sz w:val="18"/>
+              </w:rPr>
+              <w:t>Tasa de arribo buques feeder</w:t>
+            </w:r>
+          </w:p>
+        </w:tc>
+        <w:tc>
+          <w:tcPr>
+            <w:tcW w:type="dxa" w:w="1560"/>
+            <w:shd w:fill="F2F5F9"/>
+            <w:tcMar>
+              <w:top w:w="60" w:type="dxa"/>
+              <w:bottom w:w="60" w:type="dxa"/>
+              <w:left w:w="100" w:type="dxa"/>
+              <w:right w:w="100" w:type="dxa"/>
+            </w:tcMar>
+          </w:tcPr>
+          <w:p>
+            <w:r>
+              <w:rPr>
+                <w:sz w:val="18"/>
+              </w:rPr>
+              <w:t>buques/día</w:t>
+            </w:r>
+          </w:p>
+        </w:tc>
+        <w:tc>
+          <w:tcPr>
+            <w:tcW w:type="dxa" w:w="1560"/>
+            <w:shd w:fill="F2F5F9"/>
+            <w:tcMar>
+              <w:top w:w="60" w:type="dxa"/>
+              <w:bottom w:w="60" w:type="dxa"/>
+              <w:left w:w="100" w:type="dxa"/>
+              <w:right w:w="100" w:type="dxa"/>
+            </w:tcMar>
+          </w:tcPr>
+          <w:p>
+            <w:r>
+              <w:rPr>
+                <w:sz w:val="18"/>
+              </w:rPr>
+              <w:t>8.09 b/d</w:t>
+            </w:r>
+          </w:p>
+        </w:tc>
+        <w:tc>
+          <w:tcPr>
+            <w:tcW w:type="dxa" w:w="1560"/>
+            <w:shd w:fill="F2F5F9"/>
+            <w:tcMar>
+              <w:top w:w="60" w:type="dxa"/>
+              <w:bottom w:w="60" w:type="dxa"/>
+              <w:left w:w="100" w:type="dxa"/>
+              <w:right w:w="100" w:type="dxa"/>
+            </w:tcMar>
+          </w:tcPr>
+          <w:p>
+            <w:r>
+              <w:rPr>
+                <w:sz w:val="18"/>
+              </w:rPr>
+              <w:t>Histórico escalas G08</w:t>
+            </w:r>
+          </w:p>
+        </w:tc>
+        <w:tc>
+          <w:tcPr>
+            <w:tcW w:type="dxa" w:w="1560"/>
+            <w:shd w:fill="F2F5F9"/>
+            <w:tcMar>
+              <w:top w:w="60" w:type="dxa"/>
+              <w:bottom w:w="60" w:type="dxa"/>
+              <w:left w:w="100" w:type="dxa"/>
+              <w:right w:w="100" w:type="dxa"/>
+            </w:tcMar>
+          </w:tcPr>
+          <w:p>
+            <w:r>
+              <w:rPr>
+                <w:sz w:val="18"/>
+              </w:rPr>
+              <w:t>Poisson no homogéneo (Delta t ~ Exp(2.97h))</w:t>
+            </w:r>
+          </w:p>
+        </w:tc>
+      </w:tr>
+      <w:tr>
+        <w:tc>
+          <w:tcPr>
+            <w:tcW w:type="dxa" w:w="1560"/>
+            <w:tcMar>
+              <w:top w:w="60" w:type="dxa"/>
+              <w:bottom w:w="60" w:type="dxa"/>
+              <w:left w:w="100" w:type="dxa"/>
+              <w:right w:w="100" w:type="dxa"/>
+            </w:tcMar>
+          </w:tcPr>
+          <w:p>
+            <w:r>
+              <w:rPr>
+                <w:sz w:val="18"/>
+              </w:rPr>
+              <w:t>Mix</w:t>
+            </w:r>
+          </w:p>
+        </w:tc>
+        <w:tc>
+          <w:tcPr>
+            <w:tcW w:type="dxa" w:w="1560"/>
+            <w:tcMar>
+              <w:top w:w="60" w:type="dxa"/>
+              <w:bottom w:w="60" w:type="dxa"/>
+              <w:left w:w="100" w:type="dxa"/>
+              <w:right w:w="100" w:type="dxa"/>
+            </w:tcMar>
+          </w:tcPr>
+          <w:p>
+            <w:r>
+              <w:rPr>
+                <w:sz w:val="18"/>
+              </w:rPr>
+              <w:t>Composición de carga por escala</w:t>
+            </w:r>
+          </w:p>
+        </w:tc>
+        <w:tc>
+          <w:tcPr>
+            <w:tcW w:type="dxa" w:w="1560"/>
+            <w:tcMar>
+              <w:top w:w="60" w:type="dxa"/>
+              <w:bottom w:w="60" w:type="dxa"/>
+              <w:left w:w="100" w:type="dxa"/>
+              <w:right w:w="100" w:type="dxa"/>
+            </w:tcMar>
+          </w:tcPr>
+          <w:p>
+            <w:r>
+              <w:rPr>
+                <w:sz w:val="18"/>
+              </w:rPr>
+              <w:t>% mov</w:t>
+            </w:r>
+          </w:p>
+        </w:tc>
+        <w:tc>
+          <w:tcPr>
+            <w:tcW w:type="dxa" w:w="1560"/>
+            <w:tcMar>
+              <w:top w:w="60" w:type="dxa"/>
+              <w:bottom w:w="60" w:type="dxa"/>
+              <w:left w:w="100" w:type="dxa"/>
+              <w:right w:w="100" w:type="dxa"/>
+            </w:tcMar>
+          </w:tcPr>
+          <w:p>
+            <w:r>
+              <w:rPr>
+                <w:sz w:val="18"/>
+              </w:rPr>
+              <w:t>55% Dry, 35% Reefer, 10% OOG</w:t>
+            </w:r>
+          </w:p>
+        </w:tc>
+        <w:tc>
+          <w:tcPr>
+            <w:tcW w:type="dxa" w:w="1560"/>
+            <w:tcMar>
+              <w:top w:w="60" w:type="dxa"/>
+              <w:bottom w:w="60" w:type="dxa"/>
+              <w:left w:w="100" w:type="dxa"/>
+              <w:right w:w="100" w:type="dxa"/>
+            </w:tcMar>
+          </w:tcPr>
+          <w:p>
+            <w:r>
+              <w:rPr>
+                <w:sz w:val="18"/>
+              </w:rPr>
+              <w:t>8.852 escalas G08</w:t>
+            </w:r>
+          </w:p>
+        </w:tc>
+        <w:tc>
+          <w:tcPr>
+            <w:tcW w:type="dxa" w:w="1560"/>
+            <w:tcMar>
+              <w:top w:w="60" w:type="dxa"/>
+              <w:bottom w:w="60" w:type="dxa"/>
+              <w:left w:w="100" w:type="dxa"/>
+              <w:right w:w="100" w:type="dxa"/>
+            </w:tcMar>
+          </w:tcPr>
+          <w:p>
+            <w:r>
+              <w:rPr>
+                <w:sz w:val="18"/>
+              </w:rPr>
+              <w:t>Empírica por servicio</w:t>
+            </w:r>
+          </w:p>
+        </w:tc>
+      </w:tr>
+      <w:tr>
+        <w:tc>
+          <w:tcPr>
+            <w:tcW w:type="dxa" w:w="1560"/>
+            <w:shd w:fill="F2F5F9"/>
+            <w:tcMar>
+              <w:top w:w="60" w:type="dxa"/>
+              <w:bottom w:w="60" w:type="dxa"/>
+              <w:left w:w="100" w:type="dxa"/>
+              <w:right w:w="100" w:type="dxa"/>
+            </w:tcMar>
+          </w:tcPr>
+          <w:p>
+            <w:r>
+              <w:rPr>
+                <w:sz w:val="18"/>
+              </w:rPr>
+              <w:t>mu_dry</w:t>
+            </w:r>
+          </w:p>
+        </w:tc>
+        <w:tc>
+          <w:tcPr>
+            <w:tcW w:type="dxa" w:w="1560"/>
+            <w:shd w:fill="F2F5F9"/>
+            <w:tcMar>
+              <w:top w:w="60" w:type="dxa"/>
+              <w:bottom w:w="60" w:type="dxa"/>
+              <w:left w:w="100" w:type="dxa"/>
+              <w:right w:w="100" w:type="dxa"/>
+            </w:tcMar>
+          </w:tcPr>
+          <w:p>
+            <w:r>
+              <w:rPr>
+                <w:sz w:val="18"/>
+              </w:rPr>
+              <w:t>Rendimiento grúa Dry</w:t>
+            </w:r>
+          </w:p>
+        </w:tc>
+        <w:tc>
+          <w:tcPr>
+            <w:tcW w:type="dxa" w:w="1560"/>
+            <w:shd w:fill="F2F5F9"/>
+            <w:tcMar>
+              <w:top w:w="60" w:type="dxa"/>
+              <w:bottom w:w="60" w:type="dxa"/>
+              <w:left w:w="100" w:type="dxa"/>
+              <w:right w:w="100" w:type="dxa"/>
+            </w:tcMar>
+          </w:tcPr>
+          <w:p>
+            <w:r>
+              <w:rPr>
+                <w:sz w:val="18"/>
+              </w:rPr>
+              <w:t>mov/hora</w:t>
+            </w:r>
+          </w:p>
+        </w:tc>
+        <w:tc>
+          <w:tcPr>
+            <w:tcW w:type="dxa" w:w="1560"/>
+            <w:shd w:fill="F2F5F9"/>
+            <w:tcMar>
+              <w:top w:w="60" w:type="dxa"/>
+              <w:bottom w:w="60" w:type="dxa"/>
+              <w:left w:w="100" w:type="dxa"/>
+              <w:right w:w="100" w:type="dxa"/>
+            </w:tcMar>
+          </w:tcPr>
+          <w:p>
+            <w:r>
+              <w:rPr>
+                <w:sz w:val="18"/>
+              </w:rPr>
+              <w:t>28</w:t>
+            </w:r>
+          </w:p>
+        </w:tc>
+        <w:tc>
+          <w:tcPr>
+            <w:tcW w:type="dxa" w:w="1560"/>
+            <w:shd w:fill="F2F5F9"/>
+            <w:tcMar>
+              <w:top w:w="60" w:type="dxa"/>
+              <w:bottom w:w="60" w:type="dxa"/>
+              <w:left w:w="100" w:type="dxa"/>
+              <w:right w:w="100" w:type="dxa"/>
+            </w:tcMar>
+          </w:tcPr>
+          <w:p>
+            <w:r>
+              <w:rPr>
+                <w:sz w:val="18"/>
+              </w:rPr>
+              <w:t>Tasa nominal directa</w:t>
+            </w:r>
+          </w:p>
+        </w:tc>
+        <w:tc>
+          <w:tcPr>
+            <w:tcW w:type="dxa" w:w="1560"/>
+            <w:shd w:fill="F2F5F9"/>
+            <w:tcMar>
+              <w:top w:w="60" w:type="dxa"/>
+              <w:bottom w:w="60" w:type="dxa"/>
+              <w:left w:w="100" w:type="dxa"/>
+              <w:right w:w="100" w:type="dxa"/>
+            </w:tcMar>
+          </w:tcPr>
+          <w:p>
+            <w:r>
+              <w:rPr>
+                <w:sz w:val="18"/>
+              </w:rPr>
+              <w:t>Determinística</w:t>
+            </w:r>
+          </w:p>
+        </w:tc>
+      </w:tr>
+      <w:tr>
+        <w:tc>
+          <w:tcPr>
+            <w:tcW w:type="dxa" w:w="1560"/>
+            <w:tcMar>
+              <w:top w:w="60" w:type="dxa"/>
+              <w:bottom w:w="60" w:type="dxa"/>
+              <w:left w:w="100" w:type="dxa"/>
+              <w:right w:w="100" w:type="dxa"/>
+            </w:tcMar>
+          </w:tcPr>
+          <w:p>
+            <w:r>
+              <w:rPr>
+                <w:sz w:val="18"/>
+              </w:rPr>
+              <w:t>mu_reefer</w:t>
+            </w:r>
+          </w:p>
+        </w:tc>
+        <w:tc>
+          <w:tcPr>
+            <w:tcW w:type="dxa" w:w="1560"/>
+            <w:tcMar>
+              <w:top w:w="60" w:type="dxa"/>
+              <w:bottom w:w="60" w:type="dxa"/>
+              <w:left w:w="100" w:type="dxa"/>
+              <w:right w:w="100" w:type="dxa"/>
+            </w:tcMar>
+          </w:tcPr>
+          <w:p>
+            <w:r>
+              <w:rPr>
+                <w:sz w:val="18"/>
+              </w:rPr>
+              <w:t>Rendimiento grúa Reefer</w:t>
+            </w:r>
+          </w:p>
+        </w:tc>
+        <w:tc>
+          <w:tcPr>
+            <w:tcW w:type="dxa" w:w="1560"/>
+            <w:tcMar>
+              <w:top w:w="60" w:type="dxa"/>
+              <w:bottom w:w="60" w:type="dxa"/>
+              <w:left w:w="100" w:type="dxa"/>
+              <w:right w:w="100" w:type="dxa"/>
+            </w:tcMar>
+          </w:tcPr>
+          <w:p>
+            <w:r>
+              <w:rPr>
+                <w:sz w:val="18"/>
+              </w:rPr>
+              <w:t>mov/hora</w:t>
+            </w:r>
+          </w:p>
+        </w:tc>
+        <w:tc>
+          <w:tcPr>
+            <w:tcW w:type="dxa" w:w="1560"/>
+            <w:tcMar>
+              <w:top w:w="60" w:type="dxa"/>
+              <w:bottom w:w="60" w:type="dxa"/>
+              <w:left w:w="100" w:type="dxa"/>
+              <w:right w:w="100" w:type="dxa"/>
+            </w:tcMar>
+          </w:tcPr>
+          <w:p>
+            <w:r>
+              <w:rPr>
+                <w:sz w:val="18"/>
+              </w:rPr>
+              <w:t>21</w:t>
+            </w:r>
+          </w:p>
+        </w:tc>
+        <w:tc>
+          <w:tcPr>
+            <w:tcW w:type="dxa" w:w="1560"/>
+            <w:tcMar>
+              <w:top w:w="60" w:type="dxa"/>
+              <w:bottom w:w="60" w:type="dxa"/>
+              <w:left w:w="100" w:type="dxa"/>
+              <w:right w:w="100" w:type="dxa"/>
+            </w:tcMar>
+          </w:tcPr>
+          <w:p>
+            <w:r>
+              <w:rPr>
+                <w:sz w:val="18"/>
+              </w:rPr>
+              <w:t>mu_dry * 0.75 (-25%)</w:t>
+            </w:r>
+          </w:p>
+        </w:tc>
+        <w:tc>
+          <w:tcPr>
+            <w:tcW w:type="dxa" w:w="1560"/>
+            <w:tcMar>
+              <w:top w:w="60" w:type="dxa"/>
+              <w:bottom w:w="60" w:type="dxa"/>
+              <w:left w:w="100" w:type="dxa"/>
+              <w:right w:w="100" w:type="dxa"/>
+            </w:tcMar>
+          </w:tcPr>
+          <w:p>
+            <w:r>
+              <w:rPr>
+                <w:sz w:val="18"/>
+              </w:rPr>
+              <w:t>Determinística</w:t>
+            </w:r>
+          </w:p>
+        </w:tc>
+      </w:tr>
+      <w:tr>
+        <w:tc>
+          <w:tcPr>
+            <w:tcW w:type="dxa" w:w="1560"/>
+            <w:shd w:fill="F2F5F9"/>
+            <w:tcMar>
+              <w:top w:w="60" w:type="dxa"/>
+              <w:bottom w:w="60" w:type="dxa"/>
+              <w:left w:w="100" w:type="dxa"/>
+              <w:right w:w="100" w:type="dxa"/>
+            </w:tcMar>
+          </w:tcPr>
+          <w:p>
+            <w:r>
+              <w:rPr>
+                <w:sz w:val="18"/>
+              </w:rPr>
+              <w:t>mu_oog</w:t>
+            </w:r>
+          </w:p>
+        </w:tc>
+        <w:tc>
+          <w:tcPr>
+            <w:tcW w:type="dxa" w:w="1560"/>
+            <w:shd w:fill="F2F5F9"/>
+            <w:tcMar>
+              <w:top w:w="60" w:type="dxa"/>
+              <w:bottom w:w="60" w:type="dxa"/>
+              <w:left w:w="100" w:type="dxa"/>
+              <w:right w:w="100" w:type="dxa"/>
+            </w:tcMar>
+          </w:tcPr>
+          <w:p>
+            <w:r>
+              <w:rPr>
+                <w:sz w:val="18"/>
+              </w:rPr>
+              <w:t>Rendimiento grúa OOG</w:t>
+            </w:r>
+          </w:p>
+        </w:tc>
+        <w:tc>
+          <w:tcPr>
+            <w:tcW w:type="dxa" w:w="1560"/>
+            <w:shd w:fill="F2F5F9"/>
+            <w:tcMar>
+              <w:top w:w="60" w:type="dxa"/>
+              <w:bottom w:w="60" w:type="dxa"/>
+              <w:left w:w="100" w:type="dxa"/>
+              <w:right w:w="100" w:type="dxa"/>
+            </w:tcMar>
+          </w:tcPr>
+          <w:p>
+            <w:r>
+              <w:rPr>
+                <w:sz w:val="18"/>
+              </w:rPr>
+              <w:t>mov/hora</w:t>
+            </w:r>
+          </w:p>
+        </w:tc>
+        <w:tc>
+          <w:tcPr>
+            <w:tcW w:type="dxa" w:w="1560"/>
+            <w:shd w:fill="F2F5F9"/>
+            <w:tcMar>
+              <w:top w:w="60" w:type="dxa"/>
+              <w:bottom w:w="60" w:type="dxa"/>
+              <w:left w:w="100" w:type="dxa"/>
+              <w:right w:w="100" w:type="dxa"/>
+            </w:tcMar>
+          </w:tcPr>
+          <w:p>
+            <w:r>
+              <w:rPr>
+                <w:sz w:val="18"/>
+              </w:rPr>
+              <w:t>12</w:t>
+            </w:r>
+          </w:p>
+        </w:tc>
+        <w:tc>
+          <w:tcPr>
+            <w:tcW w:type="dxa" w:w="1560"/>
+            <w:shd w:fill="F2F5F9"/>
+            <w:tcMar>
+              <w:top w:w="60" w:type="dxa"/>
+              <w:bottom w:w="60" w:type="dxa"/>
+              <w:left w:w="100" w:type="dxa"/>
+              <w:right w:w="100" w:type="dxa"/>
+            </w:tcMar>
+          </w:tcPr>
+          <w:p>
+            <w:r>
+              <w:rPr>
+                <w:sz w:val="18"/>
+              </w:rPr>
+              <w:t>Aparejos especiales</w:t>
+            </w:r>
+          </w:p>
+        </w:tc>
+        <w:tc>
+          <w:tcPr>
+            <w:tcW w:type="dxa" w:w="1560"/>
+            <w:shd w:fill="F2F5F9"/>
+            <w:tcMar>
+              <w:top w:w="60" w:type="dxa"/>
+              <w:bottom w:w="60" w:type="dxa"/>
+              <w:left w:w="100" w:type="dxa"/>
+              <w:right w:w="100" w:type="dxa"/>
+            </w:tcMar>
+          </w:tcPr>
+          <w:p>
+            <w:r>
+              <w:rPr>
+                <w:sz w:val="18"/>
+              </w:rPr>
+              <w:t>Determinística</w:t>
+            </w:r>
+          </w:p>
+        </w:tc>
+      </w:tr>
+      <w:tr>
+        <w:tc>
+          <w:tcPr>
+            <w:tcW w:type="dxa" w:w="1560"/>
+            <w:tcMar>
+              <w:top w:w="60" w:type="dxa"/>
+              <w:bottom w:w="60" w:type="dxa"/>
+              <w:left w:w="100" w:type="dxa"/>
+              <w:right w:w="100" w:type="dxa"/>
+            </w:tcMar>
+          </w:tcPr>
+          <w:p>
+            <w:r>
+              <w:rPr>
+                <w:sz w:val="18"/>
+              </w:rPr>
+              <w:t>eta</w:t>
+            </w:r>
+          </w:p>
+        </w:tc>
+        <w:tc>
+          <w:tcPr>
+            <w:tcW w:type="dxa" w:w="1560"/>
+            <w:tcMar>
+              <w:top w:w="60" w:type="dxa"/>
+              <w:bottom w:w="60" w:type="dxa"/>
+              <w:left w:w="100" w:type="dxa"/>
+              <w:right w:w="100" w:type="dxa"/>
+            </w:tcMar>
+          </w:tcPr>
+          <w:p>
+            <w:r>
+              <w:rPr>
+                <w:sz w:val="18"/>
+              </w:rPr>
+              <w:t>Factor interferencia doble grúa</w:t>
+            </w:r>
+          </w:p>
+        </w:tc>
+        <w:tc>
+          <w:tcPr>
+            <w:tcW w:type="dxa" w:w="1560"/>
+            <w:tcMar>
+              <w:top w:w="60" w:type="dxa"/>
+              <w:bottom w:w="60" w:type="dxa"/>
+              <w:left w:w="100" w:type="dxa"/>
+              <w:right w:w="100" w:type="dxa"/>
+            </w:tcMar>
+          </w:tcPr>
+          <w:p>
+            <w:r>
+              <w:rPr>
+                <w:sz w:val="18"/>
+              </w:rPr>
+              <w:t>factor</w:t>
+            </w:r>
+          </w:p>
+        </w:tc>
+        <w:tc>
+          <w:tcPr>
+            <w:tcW w:type="dxa" w:w="1560"/>
+            <w:tcMar>
+              <w:top w:w="60" w:type="dxa"/>
+              <w:bottom w:w="60" w:type="dxa"/>
+              <w:left w:w="100" w:type="dxa"/>
+              <w:right w:w="100" w:type="dxa"/>
+            </w:tcMar>
+          </w:tcPr>
+          <w:p>
+            <w:r>
+              <w:rPr>
+                <w:sz w:val="18"/>
+              </w:rPr>
+              <w:t>0.85</w:t>
+            </w:r>
+          </w:p>
+        </w:tc>
+        <w:tc>
+          <w:tcPr>
+            <w:tcW w:type="dxa" w:w="1560"/>
+            <w:tcMar>
+              <w:top w:w="60" w:type="dxa"/>
+              <w:bottom w:w="60" w:type="dxa"/>
+              <w:left w:w="100" w:type="dxa"/>
+              <w:right w:w="100" w:type="dxa"/>
+            </w:tcMar>
+          </w:tcPr>
+          <w:p>
+            <w:r>
+              <w:rPr>
+                <w:sz w:val="18"/>
+              </w:rPr>
+              <w:t>Prod. combinada = 1.7x</w:t>
+            </w:r>
+          </w:p>
+        </w:tc>
+        <w:tc>
+          <w:tcPr>
+            <w:tcW w:type="dxa" w:w="1560"/>
+            <w:tcMar>
+              <w:top w:w="60" w:type="dxa"/>
+              <w:bottom w:w="60" w:type="dxa"/>
+              <w:left w:w="100" w:type="dxa"/>
+              <w:right w:w="100" w:type="dxa"/>
+            </w:tcMar>
+          </w:tcPr>
+          <w:p>
+            <w:r>
+              <w:rPr>
+                <w:sz w:val="18"/>
+              </w:rPr>
+              <w:t>Determinística</w:t>
+            </w:r>
+          </w:p>
+        </w:tc>
+      </w:tr>
+      <w:tr>
+        <w:tc>
+          <w:tcPr>
+            <w:tcW w:type="dxa" w:w="1560"/>
+            <w:shd w:fill="F2F5F9"/>
+            <w:tcMar>
+              <w:top w:w="60" w:type="dxa"/>
+              <w:bottom w:w="60" w:type="dxa"/>
+              <w:left w:w="100" w:type="dxa"/>
+              <w:right w:w="100" w:type="dxa"/>
+            </w:tcMar>
+          </w:tcPr>
+          <w:p>
+            <w:r>
+              <w:rPr>
+                <w:sz w:val="18"/>
+              </w:rPr>
+              <w:t>T_maniobra</w:t>
+            </w:r>
+          </w:p>
+        </w:tc>
+        <w:tc>
+          <w:tcPr>
+            <w:tcW w:type="dxa" w:w="1560"/>
+            <w:shd w:fill="F2F5F9"/>
+            <w:tcMar>
+              <w:top w:w="60" w:type="dxa"/>
+              <w:bottom w:w="60" w:type="dxa"/>
+              <w:left w:w="100" w:type="dxa"/>
+              <w:right w:w="100" w:type="dxa"/>
+            </w:tcMar>
+          </w:tcPr>
+          <w:p>
+            <w:r>
+              <w:rPr>
+                <w:sz w:val="18"/>
+              </w:rPr>
+              <w:t>Maniobras atraque + desatraque</w:t>
+            </w:r>
+          </w:p>
+        </w:tc>
+        <w:tc>
+          <w:tcPr>
+            <w:tcW w:type="dxa" w:w="1560"/>
+            <w:shd w:fill="F2F5F9"/>
+            <w:tcMar>
+              <w:top w:w="60" w:type="dxa"/>
+              <w:bottom w:w="60" w:type="dxa"/>
+              <w:left w:w="100" w:type="dxa"/>
+              <w:right w:w="100" w:type="dxa"/>
+            </w:tcMar>
+          </w:tcPr>
+          <w:p>
+            <w:r>
+              <w:rPr>
+                <w:sz w:val="18"/>
+              </w:rPr>
+              <w:t>horas</w:t>
+            </w:r>
+          </w:p>
+        </w:tc>
+        <w:tc>
+          <w:tcPr>
+            <w:tcW w:type="dxa" w:w="1560"/>
+            <w:shd w:fill="F2F5F9"/>
+            <w:tcMar>
+              <w:top w:w="60" w:type="dxa"/>
+              <w:bottom w:w="60" w:type="dxa"/>
+              <w:left w:w="100" w:type="dxa"/>
+              <w:right w:w="100" w:type="dxa"/>
+            </w:tcMar>
+          </w:tcPr>
+          <w:p>
+            <w:r>
+              <w:rPr>
+                <w:sz w:val="18"/>
+              </w:rPr>
+              <w:t>[1.0, 2.0]</w:t>
+            </w:r>
+          </w:p>
+        </w:tc>
+        <w:tc>
+          <w:tcPr>
+            <w:tcW w:type="dxa" w:w="1560"/>
+            <w:shd w:fill="F2F5F9"/>
+            <w:tcMar>
+              <w:top w:w="60" w:type="dxa"/>
+              <w:bottom w:w="60" w:type="dxa"/>
+              <w:left w:w="100" w:type="dxa"/>
+              <w:right w:w="100" w:type="dxa"/>
+            </w:tcMar>
+          </w:tcPr>
+          <w:p>
+            <w:r>
+              <w:rPr>
+                <w:sz w:val="18"/>
+              </w:rPr>
+              <w:t>Conjunto entre 1 y 2 h</w:t>
+            </w:r>
+          </w:p>
+        </w:tc>
+        <w:tc>
+          <w:tcPr>
+            <w:tcW w:type="dxa" w:w="1560"/>
+            <w:shd w:fill="F2F5F9"/>
+            <w:tcMar>
+              <w:top w:w="60" w:type="dxa"/>
+              <w:bottom w:w="60" w:type="dxa"/>
+              <w:left w:w="100" w:type="dxa"/>
+              <w:right w:w="100" w:type="dxa"/>
+            </w:tcMar>
+          </w:tcPr>
+          <w:p>
+            <w:r>
+              <w:rPr>
+                <w:sz w:val="18"/>
+              </w:rPr>
+              <w:t>Aleatoria U(1.0, 2.0) h (media 1.5h)</w:t>
+            </w:r>
+          </w:p>
+        </w:tc>
+      </w:tr>
+      <w:tr>
+        <w:tc>
+          <w:tcPr>
+            <w:tcW w:type="dxa" w:w="1560"/>
+            <w:tcMar>
+              <w:top w:w="60" w:type="dxa"/>
+              <w:bottom w:w="60" w:type="dxa"/>
+              <w:left w:w="100" w:type="dxa"/>
+              <w:right w:w="100" w:type="dxa"/>
+            </w:tcMar>
+          </w:tcPr>
+          <w:p>
+            <w:r>
+              <w:rPr>
+                <w:sz w:val="18"/>
+              </w:rPr>
+              <w:t>T_cambio</w:t>
+            </w:r>
+          </w:p>
+        </w:tc>
+        <w:tc>
+          <w:tcPr>
+            <w:tcW w:type="dxa" w:w="1560"/>
+            <w:tcMar>
+              <w:top w:w="60" w:type="dxa"/>
+              <w:bottom w:w="60" w:type="dxa"/>
+              <w:left w:w="100" w:type="dxa"/>
+              <w:right w:w="100" w:type="dxa"/>
+            </w:tcMar>
+          </w:tcPr>
+          <w:p>
+            <w:r>
+              <w:rPr>
+                <w:sz w:val="18"/>
+              </w:rPr>
+              <w:t>Paradas de cambio de guardia</w:t>
+            </w:r>
+          </w:p>
+        </w:tc>
+        <w:tc>
+          <w:tcPr>
+            <w:tcW w:type="dxa" w:w="1560"/>
+            <w:tcMar>
+              <w:top w:w="60" w:type="dxa"/>
+              <w:bottom w:w="60" w:type="dxa"/>
+              <w:left w:w="100" w:type="dxa"/>
+              <w:right w:w="100" w:type="dxa"/>
+            </w:tcMar>
+          </w:tcPr>
+          <w:p>
+            <w:r>
+              <w:rPr>
+                <w:sz w:val="18"/>
+              </w:rPr>
+              <w:t>minutos</w:t>
+            </w:r>
+          </w:p>
+        </w:tc>
+        <w:tc>
+          <w:tcPr>
+            <w:tcW w:type="dxa" w:w="1560"/>
+            <w:tcMar>
+              <w:top w:w="60" w:type="dxa"/>
+              <w:bottom w:w="60" w:type="dxa"/>
+              <w:left w:w="100" w:type="dxa"/>
+              <w:right w:w="100" w:type="dxa"/>
+            </w:tcMar>
+          </w:tcPr>
+          <w:p>
+            <w:r>
+              <w:rPr>
+                <w:sz w:val="18"/>
+              </w:rPr>
+              <w:t>[10, 15]</w:t>
+            </w:r>
+          </w:p>
+        </w:tc>
+        <w:tc>
+          <w:tcPr>
+            <w:tcW w:type="dxa" w:w="1560"/>
+            <w:tcMar>
+              <w:top w:w="60" w:type="dxa"/>
+              <w:bottom w:w="60" w:type="dxa"/>
+              <w:left w:w="100" w:type="dxa"/>
+              <w:right w:w="100" w:type="dxa"/>
+            </w:tcMar>
+          </w:tcPr>
+          <w:p>
+            <w:r>
+              <w:rPr>
+                <w:sz w:val="18"/>
+              </w:rPr>
+              <w:t>Cada 8h (00, 08, 16h)</w:t>
+            </w:r>
+          </w:p>
+        </w:tc>
+        <w:tc>
+          <w:tcPr>
+            <w:tcW w:type="dxa" w:w="1560"/>
+            <w:tcMar>
+              <w:top w:w="60" w:type="dxa"/>
+              <w:bottom w:w="60" w:type="dxa"/>
+              <w:left w:w="100" w:type="dxa"/>
+              <w:right w:w="100" w:type="dxa"/>
+            </w:tcMar>
+          </w:tcPr>
+          <w:p>
+            <w:r>
+              <w:rPr>
+                <w:sz w:val="18"/>
+              </w:rPr>
+              <w:t>Aleatoria U(10, 15) min</w:t>
+            </w:r>
+          </w:p>
+        </w:tc>
+      </w:tr>
+      <w:tr>
+        <w:tc>
+          <w:tcPr>
+            <w:tcW w:type="dxa" w:w="1560"/>
+            <w:shd w:fill="F2F5F9"/>
+            <w:tcMar>
+              <w:top w:w="60" w:type="dxa"/>
+              <w:bottom w:w="60" w:type="dxa"/>
+              <w:left w:w="100" w:type="dxa"/>
+              <w:right w:w="100" w:type="dxa"/>
+            </w:tcMar>
+          </w:tcPr>
+          <w:p>
+            <w:r>
+              <w:rPr>
+                <w:sz w:val="18"/>
+              </w:rPr>
+              <w:t>Cap_patio</w:t>
+            </w:r>
+          </w:p>
+        </w:tc>
+        <w:tc>
+          <w:tcPr>
+            <w:tcW w:type="dxa" w:w="1560"/>
+            <w:shd w:fill="F2F5F9"/>
+            <w:tcMar>
+              <w:top w:w="60" w:type="dxa"/>
+              <w:bottom w:w="60" w:type="dxa"/>
+              <w:left w:w="100" w:type="dxa"/>
+              <w:right w:w="100" w:type="dxa"/>
+            </w:tcMar>
+          </w:tcPr>
+          <w:p>
+            <w:r>
+              <w:rPr>
+                <w:sz w:val="18"/>
+              </w:rPr>
+              <w:t>Capacidad estática patio</w:t>
+            </w:r>
+          </w:p>
+        </w:tc>
+        <w:tc>
+          <w:tcPr>
+            <w:tcW w:type="dxa" w:w="1560"/>
+            <w:shd w:fill="F2F5F9"/>
+            <w:tcMar>
+              <w:top w:w="60" w:type="dxa"/>
+              <w:bottom w:w="60" w:type="dxa"/>
+              <w:left w:w="100" w:type="dxa"/>
+              <w:right w:w="100" w:type="dxa"/>
+            </w:tcMar>
+          </w:tcPr>
+          <w:p>
+            <w:r>
+              <w:rPr>
+                <w:sz w:val="18"/>
+              </w:rPr>
+              <w:t>slots</w:t>
+            </w:r>
+          </w:p>
+        </w:tc>
+        <w:tc>
+          <w:tcPr>
+            <w:tcW w:type="dxa" w:w="1560"/>
+            <w:shd w:fill="F2F5F9"/>
+            <w:tcMar>
+              <w:top w:w="60" w:type="dxa"/>
+              <w:bottom w:w="60" w:type="dxa"/>
+              <w:left w:w="100" w:type="dxa"/>
+              <w:right w:w="100" w:type="dxa"/>
+            </w:tcMar>
+          </w:tcPr>
+          <w:p>
+            <w:r>
+              <w:rPr>
+                <w:sz w:val="18"/>
+              </w:rPr>
+              <w:t>3.000</w:t>
+            </w:r>
+          </w:p>
+        </w:tc>
+        <w:tc>
+          <w:tcPr>
+            <w:tcW w:type="dxa" w:w="1560"/>
+            <w:shd w:fill="F2F5F9"/>
+            <w:tcMar>
+              <w:top w:w="60" w:type="dxa"/>
+              <w:bottom w:w="60" w:type="dxa"/>
+              <w:left w:w="100" w:type="dxa"/>
+              <w:right w:w="100" w:type="dxa"/>
+            </w:tcMar>
+          </w:tcPr>
+          <w:p>
+            <w:r>
+              <w:rPr>
+                <w:sz w:val="18"/>
+              </w:rPr>
+              <w:t>Límite físico</w:t>
+            </w:r>
+          </w:p>
+        </w:tc>
+        <w:tc>
+          <w:tcPr>
+            <w:tcW w:type="dxa" w:w="1560"/>
+            <w:shd w:fill="F2F5F9"/>
+            <w:tcMar>
+              <w:top w:w="60" w:type="dxa"/>
+              <w:bottom w:w="60" w:type="dxa"/>
+              <w:left w:w="100" w:type="dxa"/>
+              <w:right w:w="100" w:type="dxa"/>
+            </w:tcMar>
+          </w:tcPr>
+          <w:p>
+            <w:r>
+              <w:rPr>
+                <w:sz w:val="18"/>
+              </w:rPr>
+              <w:t>Alerta congestión &gt; 2.250 slots (75%)</w:t>
+            </w:r>
+          </w:p>
+        </w:tc>
+      </w:tr>
+      <w:tr>
+        <w:tc>
+          <w:tcPr>
+            <w:tcW w:type="dxa" w:w="1560"/>
+            <w:tcMar>
+              <w:top w:w="60" w:type="dxa"/>
+              <w:bottom w:w="60" w:type="dxa"/>
+              <w:left w:w="100" w:type="dxa"/>
+              <w:right w:w="100" w:type="dxa"/>
+            </w:tcMar>
+          </w:tcPr>
+          <w:p>
+            <w:r>
+              <w:rPr>
+                <w:sz w:val="18"/>
+              </w:rPr>
+              <w:t>T_dwell</w:t>
+            </w:r>
+          </w:p>
+        </w:tc>
+        <w:tc>
+          <w:tcPr>
+            <w:tcW w:type="dxa" w:w="1560"/>
+            <w:tcMar>
+              <w:top w:w="60" w:type="dxa"/>
+              <w:bottom w:w="60" w:type="dxa"/>
+              <w:left w:w="100" w:type="dxa"/>
+              <w:right w:w="100" w:type="dxa"/>
+            </w:tcMar>
+          </w:tcPr>
+          <w:p>
+            <w:r>
+              <w:rPr>
+                <w:sz w:val="18"/>
+              </w:rPr>
+              <w:t>Permanencia en patio</w:t>
+            </w:r>
+          </w:p>
+        </w:tc>
+        <w:tc>
+          <w:tcPr>
+            <w:tcW w:type="dxa" w:w="1560"/>
+            <w:tcMar>
+              <w:top w:w="60" w:type="dxa"/>
+              <w:bottom w:w="60" w:type="dxa"/>
+              <w:left w:w="100" w:type="dxa"/>
+              <w:right w:w="100" w:type="dxa"/>
+            </w:tcMar>
+          </w:tcPr>
+          <w:p>
+            <w:r>
+              <w:rPr>
+                <w:sz w:val="18"/>
+              </w:rPr>
+              <w:t>horas</w:t>
+            </w:r>
+          </w:p>
+        </w:tc>
+        <w:tc>
+          <w:tcPr>
+            <w:tcW w:type="dxa" w:w="1560"/>
+            <w:tcMar>
+              <w:top w:w="60" w:type="dxa"/>
+              <w:bottom w:w="60" w:type="dxa"/>
+              <w:left w:w="100" w:type="dxa"/>
+              <w:right w:w="100" w:type="dxa"/>
+            </w:tcMar>
+          </w:tcPr>
+          <w:p>
+            <w:r>
+              <w:rPr>
+                <w:sz w:val="18"/>
+              </w:rPr>
+              <w:t>72</w:t>
+            </w:r>
+          </w:p>
+        </w:tc>
+        <w:tc>
+          <w:tcPr>
+            <w:tcW w:type="dxa" w:w="1560"/>
+            <w:tcMar>
+              <w:top w:w="60" w:type="dxa"/>
+              <w:bottom w:w="60" w:type="dxa"/>
+              <w:left w:w="100" w:type="dxa"/>
+              <w:right w:w="100" w:type="dxa"/>
+            </w:tcMar>
+          </w:tcPr>
+          <w:p>
+            <w:r>
+              <w:rPr>
+                <w:sz w:val="18"/>
+              </w:rPr>
+              <w:t>Almacenaje en tierra</w:t>
+            </w:r>
+          </w:p>
+        </w:tc>
+        <w:tc>
+          <w:tcPr>
+            <w:tcW w:type="dxa" w:w="1560"/>
+            <w:tcMar>
+              <w:top w:w="60" w:type="dxa"/>
+              <w:bottom w:w="60" w:type="dxa"/>
+              <w:left w:w="100" w:type="dxa"/>
+              <w:right w:w="100" w:type="dxa"/>
+            </w:tcMar>
+          </w:tcPr>
+          <w:p>
+            <w:r>
+              <w:rPr>
+                <w:sz w:val="18"/>
+              </w:rPr>
+              <w:t>Exponencial (media = 72h)</w:t>
+            </w:r>
+          </w:p>
+        </w:tc>
+      </w:tr>
+    </w:tbl>
+    <w:p>
       <w:pPr>
         <w:pStyle w:val="Heading1"/>
       </w:pPr>
@@ -539,6 +1993,895 @@
         <w:t>El protocolo estadístico incluye eliminación del período de calentamiento, réplicas independientes, ANOVA y Test de Comparaciones Múltiples de Tukey HSD (FWER = 0.05).</w:t>
       </w:r>
     </w:p>
+    <w:p>
+      <w:r>
+        <w:rPr>
+          <w:b/>
+        </w:rPr>
+        <w:t>3.2. Plan de Cuadros y Matriz de Resultados (Diapositiva 15):</w:t>
+      </w:r>
+    </w:p>
+    <w:tbl>
+      <w:tblPr>
+        <w:tblW w:type="auto" w:w="0"/>
+        <w:jc w:val="center"/>
+        <w:tblLook w:firstColumn="1" w:firstRow="1" w:lastColumn="0" w:lastRow="0" w:noHBand="0" w:noVBand="1" w:val="04A0"/>
+      </w:tblPr>
+      <w:tblGrid>
+        <w:gridCol w:w="1560"/>
+        <w:gridCol w:w="1560"/>
+        <w:gridCol w:w="1560"/>
+        <w:gridCol w:w="1560"/>
+        <w:gridCol w:w="1560"/>
+        <w:gridCol w:w="1560"/>
+      </w:tblGrid>
+      <w:tr>
+        <w:tc>
+          <w:tcPr>
+            <w:tcW w:type="dxa" w:w="1560"/>
+            <w:shd w:fill="2F5597"/>
+            <w:tcMar>
+              <w:top w:w="100" w:type="dxa"/>
+              <w:bottom w:w="100" w:type="dxa"/>
+              <w:left w:w="120" w:type="dxa"/>
+              <w:right w:w="120" w:type="dxa"/>
+            </w:tcMar>
+          </w:tcPr>
+          <w:p>
+            <w:pPr>
+              <w:jc w:val="center"/>
+            </w:pPr>
+            <w:r>
+              <w:rPr>
+                <w:b/>
+                <w:color w:val="FFFFFF"/>
+                <w:sz w:val="19"/>
+              </w:rPr>
+              <w:t>Escenario Evaluado</w:t>
+            </w:r>
+          </w:p>
+        </w:tc>
+        <w:tc>
+          <w:tcPr>
+            <w:tcW w:type="dxa" w:w="1560"/>
+            <w:shd w:fill="2F5597"/>
+            <w:tcMar>
+              <w:top w:w="100" w:type="dxa"/>
+              <w:bottom w:w="100" w:type="dxa"/>
+              <w:left w:w="120" w:type="dxa"/>
+              <w:right w:w="120" w:type="dxa"/>
+            </w:tcMar>
+          </w:tcPr>
+          <w:p>
+            <w:pPr>
+              <w:jc w:val="center"/>
+            </w:pPr>
+            <w:r>
+              <w:rPr>
+                <w:b/>
+                <w:color w:val="FFFFFF"/>
+                <w:sz w:val="19"/>
+              </w:rPr>
+              <w:t>Variables Control</w:t>
+            </w:r>
+          </w:p>
+        </w:tc>
+        <w:tc>
+          <w:tcPr>
+            <w:tcW w:type="dxa" w:w="1560"/>
+            <w:shd w:fill="2F5597"/>
+            <w:tcMar>
+              <w:top w:w="100" w:type="dxa"/>
+              <w:bottom w:w="100" w:type="dxa"/>
+              <w:left w:w="120" w:type="dxa"/>
+              <w:right w:w="120" w:type="dxa"/>
+            </w:tcMar>
+          </w:tcPr>
+          <w:p>
+            <w:pPr>
+              <w:jc w:val="center"/>
+            </w:pPr>
+            <w:r>
+              <w:rPr>
+                <w:b/>
+                <w:color w:val="FFFFFF"/>
+                <w:sz w:val="19"/>
+              </w:rPr>
+              <w:t>W [h] (Media +- IC 95%)</w:t>
+            </w:r>
+          </w:p>
+        </w:tc>
+        <w:tc>
+          <w:tcPr>
+            <w:tcW w:type="dxa" w:w="1560"/>
+            <w:shd w:fill="2F5597"/>
+            <w:tcMar>
+              <w:top w:w="100" w:type="dxa"/>
+              <w:bottom w:w="100" w:type="dxa"/>
+              <w:left w:w="120" w:type="dxa"/>
+              <w:right w:w="120" w:type="dxa"/>
+            </w:tcMar>
+          </w:tcPr>
+          <w:p>
+            <w:pPr>
+              <w:jc w:val="center"/>
+            </w:pPr>
+            <w:r>
+              <w:rPr>
+                <w:b/>
+                <w:color w:val="FFFFFF"/>
+                <w:sz w:val="19"/>
+              </w:rPr>
+              <w:t>Wq [h] (Espera)</w:t>
+            </w:r>
+          </w:p>
+        </w:tc>
+        <w:tc>
+          <w:tcPr>
+            <w:tcW w:type="dxa" w:w="1560"/>
+            <w:shd w:fill="2F5597"/>
+            <w:tcMar>
+              <w:top w:w="100" w:type="dxa"/>
+              <w:bottom w:w="100" w:type="dxa"/>
+              <w:left w:w="120" w:type="dxa"/>
+              <w:right w:w="120" w:type="dxa"/>
+            </w:tcMar>
+          </w:tcPr>
+          <w:p>
+            <w:pPr>
+              <w:jc w:val="center"/>
+            </w:pPr>
+            <w:r>
+              <w:rPr>
+                <w:b/>
+                <w:color w:val="FFFFFF"/>
+                <w:sz w:val="19"/>
+              </w:rPr>
+              <w:t>Nivel Servicio P(W&lt;=16h)</w:t>
+            </w:r>
+          </w:p>
+        </w:tc>
+        <w:tc>
+          <w:tcPr>
+            <w:tcW w:type="dxa" w:w="1560"/>
+            <w:shd w:fill="2F5597"/>
+            <w:tcMar>
+              <w:top w:w="100" w:type="dxa"/>
+              <w:bottom w:w="100" w:type="dxa"/>
+              <w:left w:w="120" w:type="dxa"/>
+              <w:right w:w="120" w:type="dxa"/>
+            </w:tcMar>
+          </w:tcPr>
+          <w:p>
+            <w:pPr>
+              <w:jc w:val="center"/>
+            </w:pPr>
+            <w:r>
+              <w:rPr>
+                <w:b/>
+                <w:color w:val="FFFFFF"/>
+                <w:sz w:val="19"/>
+              </w:rPr>
+              <w:t>Decisión / Conclusión</w:t>
+            </w:r>
+          </w:p>
+        </w:tc>
+      </w:tr>
+      <w:tr>
+        <w:tc>
+          <w:tcPr>
+            <w:tcW w:type="dxa" w:w="1560"/>
+            <w:shd w:fill="F2F5F9"/>
+            <w:tcMar>
+              <w:top w:w="60" w:type="dxa"/>
+              <w:bottom w:w="60" w:type="dxa"/>
+              <w:left w:w="100" w:type="dxa"/>
+              <w:right w:w="100" w:type="dxa"/>
+            </w:tcMar>
+          </w:tcPr>
+          <w:p>
+            <w:r>
+              <w:rPr>
+                <w:sz w:val="18"/>
+              </w:rPr>
+              <w:t>Escenario Base (Inciso b)</w:t>
+            </w:r>
+          </w:p>
+        </w:tc>
+        <w:tc>
+          <w:tcPr>
+            <w:tcW w:type="dxa" w:w="1560"/>
+            <w:shd w:fill="F2F5F9"/>
+            <w:tcMar>
+              <w:top w:w="60" w:type="dxa"/>
+              <w:bottom w:w="60" w:type="dxa"/>
+              <w:left w:w="100" w:type="dxa"/>
+              <w:right w:w="100" w:type="dxa"/>
+            </w:tcMar>
+          </w:tcPr>
+          <w:p>
+            <w:r>
+              <w:rPr>
+                <w:sz w:val="18"/>
+              </w:rPr>
+              <w:t>B=3, G=3, Pi_std, 1G_noc</w:t>
+            </w:r>
+          </w:p>
+        </w:tc>
+        <w:tc>
+          <w:tcPr>
+            <w:tcW w:type="dxa" w:w="1560"/>
+            <w:shd w:fill="F2F5F9"/>
+            <w:tcMar>
+              <w:top w:w="60" w:type="dxa"/>
+              <w:bottom w:w="60" w:type="dxa"/>
+              <w:left w:w="100" w:type="dxa"/>
+              <w:right w:w="100" w:type="dxa"/>
+            </w:tcMar>
+          </w:tcPr>
+          <w:p>
+            <w:r>
+              <w:rPr>
+                <w:sz w:val="18"/>
+              </w:rPr>
+              <w:t>W_base +- Delta W</w:t>
+            </w:r>
+          </w:p>
+        </w:tc>
+        <w:tc>
+          <w:tcPr>
+            <w:tcW w:type="dxa" w:w="1560"/>
+            <w:shd w:fill="F2F5F9"/>
+            <w:tcMar>
+              <w:top w:w="60" w:type="dxa"/>
+              <w:bottom w:w="60" w:type="dxa"/>
+              <w:left w:w="100" w:type="dxa"/>
+              <w:right w:w="100" w:type="dxa"/>
+            </w:tcMar>
+          </w:tcPr>
+          <w:p>
+            <w:r>
+              <w:rPr>
+                <w:sz w:val="18"/>
+              </w:rPr>
+              <w:t>Wq_base</w:t>
+            </w:r>
+          </w:p>
+        </w:tc>
+        <w:tc>
+          <w:tcPr>
+            <w:tcW w:type="dxa" w:w="1560"/>
+            <w:shd w:fill="F2F5F9"/>
+            <w:tcMar>
+              <w:top w:w="60" w:type="dxa"/>
+              <w:bottom w:w="60" w:type="dxa"/>
+              <w:left w:w="100" w:type="dxa"/>
+              <w:right w:w="100" w:type="dxa"/>
+            </w:tcMar>
+          </w:tcPr>
+          <w:p>
+            <w:r>
+              <w:rPr>
+                <w:sz w:val="18"/>
+              </w:rPr>
+              <w:t>NS_base</w:t>
+            </w:r>
+          </w:p>
+        </w:tc>
+        <w:tc>
+          <w:tcPr>
+            <w:tcW w:type="dxa" w:w="1560"/>
+            <w:shd w:fill="F2F5F9"/>
+            <w:tcMar>
+              <w:top w:w="60" w:type="dxa"/>
+              <w:bottom w:w="60" w:type="dxa"/>
+              <w:left w:w="100" w:type="dxa"/>
+              <w:right w:w="100" w:type="dxa"/>
+            </w:tcMar>
+          </w:tcPr>
+          <w:p>
+            <w:r>
+              <w:rPr>
+                <w:sz w:val="18"/>
+              </w:rPr>
+              <w:t>Diagnóstico situación actual</w:t>
+            </w:r>
+          </w:p>
+        </w:tc>
+      </w:tr>
+      <w:tr>
+        <w:tc>
+          <w:tcPr>
+            <w:tcW w:type="dxa" w:w="1560"/>
+            <w:tcMar>
+              <w:top w:w="60" w:type="dxa"/>
+              <w:bottom w:w="60" w:type="dxa"/>
+              <w:left w:w="100" w:type="dxa"/>
+              <w:right w:w="100" w:type="dxa"/>
+            </w:tcMar>
+          </w:tcPr>
+          <w:p>
+            <w:r>
+              <w:rPr>
+                <w:sz w:val="18"/>
+              </w:rPr>
+              <w:t>Escenario Capacidad (Inciso c)</w:t>
+            </w:r>
+          </w:p>
+        </w:tc>
+        <w:tc>
+          <w:tcPr>
+            <w:tcW w:type="dxa" w:w="1560"/>
+            <w:tcMar>
+              <w:top w:w="60" w:type="dxa"/>
+              <w:bottom w:w="60" w:type="dxa"/>
+              <w:left w:w="100" w:type="dxa"/>
+              <w:right w:w="100" w:type="dxa"/>
+            </w:tcMar>
+          </w:tcPr>
+          <w:p>
+            <w:r>
+              <w:rPr>
+                <w:sz w:val="18"/>
+              </w:rPr>
+              <w:t>B=3, G=4 vs lambda barrido</w:t>
+            </w:r>
+          </w:p>
+        </w:tc>
+        <w:tc>
+          <w:tcPr>
+            <w:tcW w:type="dxa" w:w="1560"/>
+            <w:tcMar>
+              <w:top w:w="60" w:type="dxa"/>
+              <w:bottom w:w="60" w:type="dxa"/>
+              <w:left w:w="100" w:type="dxa"/>
+              <w:right w:w="100" w:type="dxa"/>
+            </w:tcMar>
+          </w:tcPr>
+          <w:p>
+            <w:r>
+              <w:rPr>
+                <w:sz w:val="18"/>
+              </w:rPr>
+              <w:t>W_cap +- Delta W</w:t>
+            </w:r>
+          </w:p>
+        </w:tc>
+        <w:tc>
+          <w:tcPr>
+            <w:tcW w:type="dxa" w:w="1560"/>
+            <w:tcMar>
+              <w:top w:w="60" w:type="dxa"/>
+              <w:bottom w:w="60" w:type="dxa"/>
+              <w:left w:w="100" w:type="dxa"/>
+              <w:right w:w="100" w:type="dxa"/>
+            </w:tcMar>
+          </w:tcPr>
+          <w:p>
+            <w:r>
+              <w:rPr>
+                <w:sz w:val="18"/>
+              </w:rPr>
+              <w:t>Wq_cap</w:t>
+            </w:r>
+          </w:p>
+        </w:tc>
+        <w:tc>
+          <w:tcPr>
+            <w:tcW w:type="dxa" w:w="1560"/>
+            <w:tcMar>
+              <w:top w:w="60" w:type="dxa"/>
+              <w:bottom w:w="60" w:type="dxa"/>
+              <w:left w:w="100" w:type="dxa"/>
+              <w:right w:w="100" w:type="dxa"/>
+            </w:tcMar>
+          </w:tcPr>
+          <w:p>
+            <w:r>
+              <w:rPr>
+                <w:sz w:val="18"/>
+              </w:rPr>
+              <w:t>NS_cap</w:t>
+            </w:r>
+          </w:p>
+        </w:tc>
+        <w:tc>
+          <w:tcPr>
+            <w:tcW w:type="dxa" w:w="1560"/>
+            <w:tcMar>
+              <w:top w:w="60" w:type="dxa"/>
+              <w:bottom w:w="60" w:type="dxa"/>
+              <w:left w:w="100" w:type="dxa"/>
+              <w:right w:w="100" w:type="dxa"/>
+            </w:tcMar>
+          </w:tcPr>
+          <w:p>
+            <w:r>
+              <w:rPr>
+                <w:sz w:val="18"/>
+              </w:rPr>
+              <w:t>Límite máx. buques/día con W &lt;= 16h</w:t>
+            </w:r>
+          </w:p>
+        </w:tc>
+      </w:tr>
+      <w:tr>
+        <w:tc>
+          <w:tcPr>
+            <w:tcW w:type="dxa" w:w="1560"/>
+            <w:shd w:fill="F2F5F9"/>
+            <w:tcMar>
+              <w:top w:w="60" w:type="dxa"/>
+              <w:bottom w:w="60" w:type="dxa"/>
+              <w:left w:w="100" w:type="dxa"/>
+              <w:right w:w="100" w:type="dxa"/>
+            </w:tcMar>
+          </w:tcPr>
+          <w:p>
+            <w:r>
+              <w:rPr>
+                <w:sz w:val="18"/>
+              </w:rPr>
+              <w:t>Escenario Patio (Inciso d)</w:t>
+            </w:r>
+          </w:p>
+        </w:tc>
+        <w:tc>
+          <w:tcPr>
+            <w:tcW w:type="dxa" w:w="1560"/>
+            <w:shd w:fill="F2F5F9"/>
+            <w:tcMar>
+              <w:top w:w="60" w:type="dxa"/>
+              <w:bottom w:w="60" w:type="dxa"/>
+              <w:left w:w="100" w:type="dxa"/>
+              <w:right w:w="100" w:type="dxa"/>
+            </w:tcMar>
+          </w:tcPr>
+          <w:p>
+            <w:r>
+              <w:rPr>
+                <w:sz w:val="18"/>
+              </w:rPr>
+              <w:t>Pi_cam in {Multa, Ventana}</w:t>
+            </w:r>
+          </w:p>
+        </w:tc>
+        <w:tc>
+          <w:tcPr>
+            <w:tcW w:type="dxa" w:w="1560"/>
+            <w:shd w:fill="F2F5F9"/>
+            <w:tcMar>
+              <w:top w:w="60" w:type="dxa"/>
+              <w:bottom w:w="60" w:type="dxa"/>
+              <w:left w:w="100" w:type="dxa"/>
+              <w:right w:w="100" w:type="dxa"/>
+            </w:tcMar>
+          </w:tcPr>
+          <w:p>
+            <w:r>
+              <w:rPr>
+                <w:sz w:val="18"/>
+              </w:rPr>
+              <w:t>W_pat +- Delta W</w:t>
+            </w:r>
+          </w:p>
+        </w:tc>
+        <w:tc>
+          <w:tcPr>
+            <w:tcW w:type="dxa" w:w="1560"/>
+            <w:shd w:fill="F2F5F9"/>
+            <w:tcMar>
+              <w:top w:w="60" w:type="dxa"/>
+              <w:bottom w:w="60" w:type="dxa"/>
+              <w:left w:w="100" w:type="dxa"/>
+              <w:right w:w="100" w:type="dxa"/>
+            </w:tcMar>
+          </w:tcPr>
+          <w:p>
+            <w:r>
+              <w:rPr>
+                <w:sz w:val="18"/>
+              </w:rPr>
+              <w:t>Wq_pat</w:t>
+            </w:r>
+          </w:p>
+        </w:tc>
+        <w:tc>
+          <w:tcPr>
+            <w:tcW w:type="dxa" w:w="1560"/>
+            <w:shd w:fill="F2F5F9"/>
+            <w:tcMar>
+              <w:top w:w="60" w:type="dxa"/>
+              <w:bottom w:w="60" w:type="dxa"/>
+              <w:left w:w="100" w:type="dxa"/>
+              <w:right w:w="100" w:type="dxa"/>
+            </w:tcMar>
+          </w:tcPr>
+          <w:p>
+            <w:r>
+              <w:rPr>
+                <w:sz w:val="18"/>
+              </w:rPr>
+              <w:t>NS_pat</w:t>
+            </w:r>
+          </w:p>
+        </w:tc>
+        <w:tc>
+          <w:tcPr>
+            <w:tcW w:type="dxa" w:w="1560"/>
+            <w:shd w:fill="F2F5F9"/>
+            <w:tcMar>
+              <w:top w:w="60" w:type="dxa"/>
+              <w:bottom w:w="60" w:type="dxa"/>
+              <w:left w:w="100" w:type="dxa"/>
+              <w:right w:w="100" w:type="dxa"/>
+            </w:tcMar>
+          </w:tcPr>
+          <w:p>
+            <w:r>
+              <w:rPr>
+                <w:sz w:val="18"/>
+              </w:rPr>
+              <w:t>Descongestión patio &lt; 75%</w:t>
+            </w:r>
+          </w:p>
+        </w:tc>
+      </w:tr>
+      <w:tr>
+        <w:tc>
+          <w:tcPr>
+            <w:tcW w:type="dxa" w:w="1560"/>
+            <w:tcMar>
+              <w:top w:w="60" w:type="dxa"/>
+              <w:bottom w:w="60" w:type="dxa"/>
+              <w:left w:w="100" w:type="dxa"/>
+              <w:right w:w="100" w:type="dxa"/>
+            </w:tcMar>
+          </w:tcPr>
+          <w:p>
+            <w:r>
+              <w:rPr>
+                <w:sz w:val="18"/>
+              </w:rPr>
+              <w:t>Escenario Cruceros (Inciso e)</w:t>
+            </w:r>
+          </w:p>
+        </w:tc>
+        <w:tc>
+          <w:tcPr>
+            <w:tcW w:type="dxa" w:w="1560"/>
+            <w:tcMar>
+              <w:top w:w="60" w:type="dxa"/>
+              <w:bottom w:w="60" w:type="dxa"/>
+              <w:left w:w="100" w:type="dxa"/>
+              <w:right w:w="100" w:type="dxa"/>
+            </w:tcMar>
+          </w:tcPr>
+          <w:p>
+            <w:r>
+              <w:rPr>
+                <w:sz w:val="18"/>
+              </w:rPr>
+              <w:t>Cede 1 Berma (B=2 carga)</w:t>
+            </w:r>
+          </w:p>
+        </w:tc>
+        <w:tc>
+          <w:tcPr>
+            <w:tcW w:type="dxa" w:w="1560"/>
+            <w:tcMar>
+              <w:top w:w="60" w:type="dxa"/>
+              <w:bottom w:w="60" w:type="dxa"/>
+              <w:left w:w="100" w:type="dxa"/>
+              <w:right w:w="100" w:type="dxa"/>
+            </w:tcMar>
+          </w:tcPr>
+          <w:p>
+            <w:r>
+              <w:rPr>
+                <w:sz w:val="18"/>
+              </w:rPr>
+              <w:t>W_cruc +- Delta W</w:t>
+            </w:r>
+          </w:p>
+        </w:tc>
+        <w:tc>
+          <w:tcPr>
+            <w:tcW w:type="dxa" w:w="1560"/>
+            <w:tcMar>
+              <w:top w:w="60" w:type="dxa"/>
+              <w:bottom w:w="60" w:type="dxa"/>
+              <w:left w:w="100" w:type="dxa"/>
+              <w:right w:w="100" w:type="dxa"/>
+            </w:tcMar>
+          </w:tcPr>
+          <w:p>
+            <w:r>
+              <w:rPr>
+                <w:sz w:val="18"/>
+              </w:rPr>
+              <w:t>Wq_cruc</w:t>
+            </w:r>
+          </w:p>
+        </w:tc>
+        <w:tc>
+          <w:tcPr>
+            <w:tcW w:type="dxa" w:w="1560"/>
+            <w:tcMar>
+              <w:top w:w="60" w:type="dxa"/>
+              <w:bottom w:w="60" w:type="dxa"/>
+              <w:left w:w="100" w:type="dxa"/>
+              <w:right w:w="100" w:type="dxa"/>
+            </w:tcMar>
+          </w:tcPr>
+          <w:p>
+            <w:r>
+              <w:rPr>
+                <w:sz w:val="18"/>
+              </w:rPr>
+              <w:t>NS_cruc</w:t>
+            </w:r>
+          </w:p>
+        </w:tc>
+        <w:tc>
+          <w:tcPr>
+            <w:tcW w:type="dxa" w:w="1560"/>
+            <w:tcMar>
+              <w:top w:w="60" w:type="dxa"/>
+              <w:bottom w:w="60" w:type="dxa"/>
+              <w:left w:w="100" w:type="dxa"/>
+              <w:right w:w="100" w:type="dxa"/>
+            </w:tcMar>
+          </w:tcPr>
+          <w:p>
+            <w:r>
+              <w:rPr>
+                <w:sz w:val="18"/>
+              </w:rPr>
+              <w:t>Impacto inmovilización vs USD 60k</w:t>
+            </w:r>
+          </w:p>
+        </w:tc>
+      </w:tr>
+      <w:tr>
+        <w:tc>
+          <w:tcPr>
+            <w:tcW w:type="dxa" w:w="1560"/>
+            <w:shd w:fill="F2F5F9"/>
+            <w:tcMar>
+              <w:top w:w="60" w:type="dxa"/>
+              <w:bottom w:w="60" w:type="dxa"/>
+              <w:left w:w="100" w:type="dxa"/>
+              <w:right w:w="100" w:type="dxa"/>
+            </w:tcMar>
+          </w:tcPr>
+          <w:p>
+            <w:r>
+              <w:rPr>
+                <w:sz w:val="18"/>
+              </w:rPr>
+              <w:t>Escenario Industrial (Inciso f)</w:t>
+            </w:r>
+          </w:p>
+        </w:tc>
+        <w:tc>
+          <w:tcPr>
+            <w:tcW w:type="dxa" w:w="1560"/>
+            <w:shd w:fill="F2F5F9"/>
+            <w:tcMar>
+              <w:top w:w="60" w:type="dxa"/>
+              <w:bottom w:w="60" w:type="dxa"/>
+              <w:left w:w="100" w:type="dxa"/>
+              <w:right w:w="100" w:type="dxa"/>
+            </w:tcMar>
+          </w:tcPr>
+          <w:p>
+            <w:r>
+              <w:rPr>
+                <w:sz w:val="18"/>
+              </w:rPr>
+              <w:t>lambda +35% y +100%</w:t>
+            </w:r>
+          </w:p>
+        </w:tc>
+        <w:tc>
+          <w:tcPr>
+            <w:tcW w:type="dxa" w:w="1560"/>
+            <w:shd w:fill="F2F5F9"/>
+            <w:tcMar>
+              <w:top w:w="60" w:type="dxa"/>
+              <w:bottom w:w="60" w:type="dxa"/>
+              <w:left w:w="100" w:type="dxa"/>
+              <w:right w:w="100" w:type="dxa"/>
+            </w:tcMar>
+          </w:tcPr>
+          <w:p>
+            <w:r>
+              <w:rPr>
+                <w:sz w:val="18"/>
+              </w:rPr>
+              <w:t>W_ind +- Delta W</w:t>
+            </w:r>
+          </w:p>
+        </w:tc>
+        <w:tc>
+          <w:tcPr>
+            <w:tcW w:type="dxa" w:w="1560"/>
+            <w:shd w:fill="F2F5F9"/>
+            <w:tcMar>
+              <w:top w:w="60" w:type="dxa"/>
+              <w:bottom w:w="60" w:type="dxa"/>
+              <w:left w:w="100" w:type="dxa"/>
+              <w:right w:w="100" w:type="dxa"/>
+            </w:tcMar>
+          </w:tcPr>
+          <w:p>
+            <w:r>
+              <w:rPr>
+                <w:sz w:val="18"/>
+              </w:rPr>
+              <w:t>Wq_ind</w:t>
+            </w:r>
+          </w:p>
+        </w:tc>
+        <w:tc>
+          <w:tcPr>
+            <w:tcW w:type="dxa" w:w="1560"/>
+            <w:shd w:fill="F2F5F9"/>
+            <w:tcMar>
+              <w:top w:w="60" w:type="dxa"/>
+              <w:bottom w:w="60" w:type="dxa"/>
+              <w:left w:w="100" w:type="dxa"/>
+              <w:right w:w="100" w:type="dxa"/>
+            </w:tcMar>
+          </w:tcPr>
+          <w:p>
+            <w:r>
+              <w:rPr>
+                <w:sz w:val="18"/>
+              </w:rPr>
+              <w:t>NS_ind</w:t>
+            </w:r>
+          </w:p>
+        </w:tc>
+        <w:tc>
+          <w:tcPr>
+            <w:tcW w:type="dxa" w:w="1560"/>
+            <w:shd w:fill="F2F5F9"/>
+            <w:tcMar>
+              <w:top w:w="60" w:type="dxa"/>
+              <w:bottom w:w="60" w:type="dxa"/>
+              <w:left w:w="100" w:type="dxa"/>
+              <w:right w:w="100" w:type="dxa"/>
+            </w:tcMar>
+          </w:tcPr>
+          <w:p>
+            <w:r>
+              <w:rPr>
+                <w:sz w:val="18"/>
+              </w:rPr>
+              <w:t>Matrices bajo incertidumbre</w:t>
+            </w:r>
+          </w:p>
+        </w:tc>
+      </w:tr>
+      <w:tr>
+        <w:tc>
+          <w:tcPr>
+            <w:tcW w:type="dxa" w:w="1560"/>
+            <w:tcMar>
+              <w:top w:w="60" w:type="dxa"/>
+              <w:bottom w:w="60" w:type="dxa"/>
+              <w:left w:w="100" w:type="dxa"/>
+              <w:right w:w="100" w:type="dxa"/>
+            </w:tcMar>
+          </w:tcPr>
+          <w:p>
+            <w:r>
+              <w:rPr>
+                <w:sz w:val="18"/>
+              </w:rPr>
+              <w:t>Escenario Payback (Inciso g)</w:t>
+            </w:r>
+          </w:p>
+        </w:tc>
+        <w:tc>
+          <w:tcPr>
+            <w:tcW w:type="dxa" w:w="1560"/>
+            <w:tcMar>
+              <w:top w:w="60" w:type="dxa"/>
+              <w:bottom w:w="60" w:type="dxa"/>
+              <w:left w:w="100" w:type="dxa"/>
+              <w:right w:w="100" w:type="dxa"/>
+            </w:tcMar>
+          </w:tcPr>
+          <w:p>
+            <w:r>
+              <w:rPr>
+                <w:sz w:val="18"/>
+              </w:rPr>
+              <w:t>Expansión 4ª Berma (B=4)</w:t>
+            </w:r>
+          </w:p>
+        </w:tc>
+        <w:tc>
+          <w:tcPr>
+            <w:tcW w:type="dxa" w:w="1560"/>
+            <w:tcMar>
+              <w:top w:w="60" w:type="dxa"/>
+              <w:bottom w:w="60" w:type="dxa"/>
+              <w:left w:w="100" w:type="dxa"/>
+              <w:right w:w="100" w:type="dxa"/>
+            </w:tcMar>
+          </w:tcPr>
+          <w:p>
+            <w:r>
+              <w:rPr>
+                <w:sz w:val="18"/>
+              </w:rPr>
+              <w:t>W_inv +- Delta W</w:t>
+            </w:r>
+          </w:p>
+        </w:tc>
+        <w:tc>
+          <w:tcPr>
+            <w:tcW w:type="dxa" w:w="1560"/>
+            <w:tcMar>
+              <w:top w:w="60" w:type="dxa"/>
+              <w:bottom w:w="60" w:type="dxa"/>
+              <w:left w:w="100" w:type="dxa"/>
+              <w:right w:w="100" w:type="dxa"/>
+            </w:tcMar>
+          </w:tcPr>
+          <w:p>
+            <w:r>
+              <w:rPr>
+                <w:sz w:val="18"/>
+              </w:rPr>
+              <w:t>Wq_inv</w:t>
+            </w:r>
+          </w:p>
+        </w:tc>
+        <w:tc>
+          <w:tcPr>
+            <w:tcW w:type="dxa" w:w="1560"/>
+            <w:tcMar>
+              <w:top w:w="60" w:type="dxa"/>
+              <w:bottom w:w="60" w:type="dxa"/>
+              <w:left w:w="100" w:type="dxa"/>
+              <w:right w:w="100" w:type="dxa"/>
+            </w:tcMar>
+          </w:tcPr>
+          <w:p>
+            <w:r>
+              <w:rPr>
+                <w:sz w:val="18"/>
+              </w:rPr>
+              <w:t>NS_inv</w:t>
+            </w:r>
+          </w:p>
+        </w:tc>
+        <w:tc>
+          <w:tcPr>
+            <w:tcW w:type="dxa" w:w="1560"/>
+            <w:tcMar>
+              <w:top w:w="60" w:type="dxa"/>
+              <w:bottom w:w="60" w:type="dxa"/>
+              <w:left w:w="100" w:type="dxa"/>
+              <w:right w:w="100" w:type="dxa"/>
+            </w:tcMar>
+          </w:tcPr>
+          <w:p>
+            <w:r>
+              <w:rPr>
+                <w:sz w:val="18"/>
+              </w:rPr>
+              <w:t>Repago inversión USD 12M</w:t>
+            </w:r>
+          </w:p>
+        </w:tc>
+      </w:tr>
+    </w:tbl>
     <w:p>
       <w:pPr>
         <w:pStyle w:val="Heading1"/>

</xml_diff>

<commit_message>
docs(conceptual): formalizar modelo conceptual con teoria IO51 (alcance, plan de cuadros, modelo de datos) y compilar word definitivo
</commit_message>
<xml_diff>
--- a/MODELO_CONCEPTUAL_G08.docx
+++ b/MODELO_CONCEPTUAL_G08.docx
@@ -169,7 +169,7 @@
                 <w:b/>
                 <w:sz w:val="18"/>
               </w:rPr>
-              <w:t>Dataset Asignado:</w:t>
+              <w:t>Integrantes:</w:t>
             </w:r>
           </w:p>
         </w:tc>
@@ -188,7 +188,7 @@
               <w:rPr>
                 <w:sz w:val="18"/>
               </w:rPr>
-              <w:t>data/PuertoSur_escalas_G08.csv (8.852 escalas históricas registradas)</w:t>
+              <w:t>Bautista Fanelli, Santiago Montiel, Benjamín ...</w:t>
             </w:r>
           </w:p>
         </w:tc>
@@ -211,7 +211,7 @@
                 <w:b/>
                 <w:sz w:val="18"/>
               </w:rPr>
-              <w:t>Metodología:</w:t>
+              <w:t>Dataset Asignado:</w:t>
             </w:r>
           </w:p>
         </w:tc>
@@ -231,7 +231,7 @@
               <w:rPr>
                 <w:sz w:val="18"/>
               </w:rPr>
-              <w:t>Simulación de Eventos Discretos (DES) &amp; Modelado IDEF0</w:t>
+              <w:t>data/PuertoSur_escalas_G08.csv (8.852 escalas históricas registradas)</w:t>
             </w:r>
           </w:p>
         </w:tc>
@@ -253,7 +253,7 @@
                 <w:b/>
                 <w:sz w:val="18"/>
               </w:rPr>
-              <w:t>Repositorio Oficial:</w:t>
+              <w:t>Metodología:</w:t>
             </w:r>
           </w:p>
         </w:tc>
@@ -272,7 +272,7 @@
               <w:rPr>
                 <w:sz w:val="18"/>
               </w:rPr>
-              <w:t>https://github.com/Santim1897/TP2-IO</w:t>
+              <w:t>Simulación de Eventos Discretos (DES) &amp; Modelado IDEF0</w:t>
             </w:r>
           </w:p>
         </w:tc>
@@ -295,6 +295,48 @@
                 <w:b/>
                 <w:sz w:val="18"/>
               </w:rPr>
+              <w:t>Repositorio Oficial:</w:t>
+            </w:r>
+          </w:p>
+        </w:tc>
+        <w:tc>
+          <w:tcPr>
+            <w:tcW w:type="dxa" w:w="4680"/>
+            <w:shd w:fill="F2F5F9"/>
+            <w:tcMar>
+              <w:top w:w="60" w:type="dxa"/>
+              <w:bottom w:w="60" w:type="dxa"/>
+              <w:left w:w="100" w:type="dxa"/>
+              <w:right w:w="100" w:type="dxa"/>
+            </w:tcMar>
+          </w:tcPr>
+          <w:p>
+            <w:r>
+              <w:rPr>
+                <w:sz w:val="18"/>
+              </w:rPr>
+              <w:t>https://github.com/Santim1897/TP2-IO</w:t>
+            </w:r>
+          </w:p>
+        </w:tc>
+      </w:tr>
+      <w:tr>
+        <w:tc>
+          <w:tcPr>
+            <w:tcW w:type="dxa" w:w="4680"/>
+            <w:tcMar>
+              <w:top w:w="60" w:type="dxa"/>
+              <w:bottom w:w="60" w:type="dxa"/>
+              <w:left w:w="100" w:type="dxa"/>
+              <w:right w:w="100" w:type="dxa"/>
+            </w:tcMar>
+          </w:tcPr>
+          <w:p>
+            <w:r>
+              <w:rPr>
+                <w:b/>
+                <w:sz w:val="18"/>
+              </w:rPr>
               <w:t>Entregable:</w:t>
             </w:r>
           </w:p>
@@ -302,7 +344,6 @@
         <w:tc>
           <w:tcPr>
             <w:tcW w:type="dxa" w:w="4680"/>
-            <w:shd w:fill="F2F5F9"/>
             <w:tcMar>
               <w:top w:w="60" w:type="dxa"/>
               <w:bottom w:w="60" w:type="dxa"/>
@@ -361,6 +402,54 @@
     <w:p>
       <w:r>
         <w:t>Modelar conceptual y computacionalmente el comportamiento estocástico y dinámico del puerto mediante Simulación de Eventos Discretos (DES), cuantificando los tiempos de espera en rada (Wq), maniobras náuticas conjuntas (U(1, 2) h en total), espera de grúas amarrado y faena efectiva en berma; contrastar la operación actual con modelos teóricos de líneas de espera (M/M/c y M/G/c); identificar los cuellos de botella en muelle y patio; y sustentar con evidencia estadística la toma de decisiones estratégicas (adición de una 4ª grúa pórtico STS, políticas de patio y camiones, incorporación de temporada de cruceros y viabilidad de una 4ª berma).</w:t>
+      </w:r>
+    </w:p>
+    <w:p>
+      <w:r>
+        <w:rPr>
+          <w:b/>
+        </w:rPr>
+        <w:t>1.3. Alcance y Supuestos Simplificatorios del Modelo (Diaps. 4 y 21):</w:t>
+      </w:r>
+    </w:p>
+    <w:p>
+      <w:r>
+        <w:t>Conforme a la metodología formal de modelado conceptual de la cátedra (orientada a responder sistemáticamente a ¿Qué? ¿Por qué? ¿Dónde? ¿Cuándo? ¿Quién? ¿Cuánto?):</w:t>
+      </w:r>
+    </w:p>
+    <w:p>
+      <w:r>
+        <w:t>• ¿Qué? (Objeto de modelado): Operación integral del muelle y frente de atraque, asignación dinámica de grúas pórtico STS, patio de almacenamiento de contenedores y maniobras náuticas de prácticos y remolcadores.</w:t>
+      </w:r>
+    </w:p>
+    <w:p>
+      <w:r>
+        <w:t>• ¿Por qué? (Propósito): Diagnosticar los cuellos de botella que amenazan el umbral contractual de 16 horas de estadía promedio (W &lt;= 16 h) y fundamentar cuantitativamente decisiones estratégicas de expansión física (4ª berma, 4ª grúa, políticas de camiones y cruceros).</w:t>
+      </w:r>
+    </w:p>
+    <w:p>
+      <w:r>
+        <w:t>• ¿Dónde? (Límites espaciales): Desde el área de fondeo en rada exterior hasta el muelle de transferencia y la puerta de salida terrestre de camiones externos (terminal gate).</w:t>
+      </w:r>
+    </w:p>
+    <w:p>
+      <w:r>
+        <w:t>• ¿Cuándo? (Horizonte temporal): Simulación continua de 3 años de operación (8.852 escalas de G08), considerando variaciones estacionales (cosecha frutícola) y ciclos diarios de 3 turnos de 8 horas.</w:t>
+      </w:r>
+    </w:p>
+    <w:p>
+      <w:r>
+        <w:t>• ¿Quién? (Actores e interacciones): Buques feeder de 3 servicios regulares, buques de crucero turístico, camiones de transporte terrestre, prácticos náuticos y operarios de estiba.</w:t>
+      </w:r>
+    </w:p>
+    <w:p>
+      <w:r>
+        <w:t>• ¿Cuánto? (Nivel de detalle): Modelado discreto a nivel de buque individual, grúa pórtico y slot de patio, agregando contenedores por tipo (Dry, Reefer, OOG).</w:t>
+      </w:r>
+    </w:p>
+    <w:p>
+      <w:r>
+        <w:t>Supuestos fundamentales: 1) Maniobras náuticas de 1 a 2 horas en conjunto por buque (media 1.5h total); 2) Máximo 2 grúas por buque con interferencia dual del 85%; 3) Balance de patio 50% import / 50% export; 4) Permanencia media en patio de 72h con 20-30% de camiones tardíos.</w:t>
       </w:r>
     </w:p>
     <w:p>
@@ -519,6 +608,1371 @@
       </w:r>
     </w:p>
     <w:p>
+      <w:r>
+        <w:rPr>
+          <w:b/>
+        </w:rPr>
+        <w:t>2.4. Tabla Formal del Modelo de Datos Cuantificado (Diapositiva 19):</w:t>
+      </w:r>
+    </w:p>
+    <w:tbl>
+      <w:tblPr>
+        <w:tblW w:type="auto" w:w="0"/>
+        <w:jc w:val="center"/>
+        <w:tblLook w:firstColumn="1" w:firstRow="1" w:lastColumn="0" w:lastRow="0" w:noHBand="0" w:noVBand="1" w:val="04A0"/>
+      </w:tblPr>
+      <w:tblGrid>
+        <w:gridCol w:w="1560"/>
+        <w:gridCol w:w="1560"/>
+        <w:gridCol w:w="1560"/>
+        <w:gridCol w:w="1560"/>
+        <w:gridCol w:w="1560"/>
+        <w:gridCol w:w="1560"/>
+      </w:tblGrid>
+      <w:tr>
+        <w:tc>
+          <w:tcPr>
+            <w:tcW w:type="dxa" w:w="1560"/>
+            <w:shd w:fill="1F4E79"/>
+            <w:tcMar>
+              <w:top w:w="100" w:type="dxa"/>
+              <w:bottom w:w="100" w:type="dxa"/>
+              <w:left w:w="120" w:type="dxa"/>
+              <w:right w:w="120" w:type="dxa"/>
+            </w:tcMar>
+          </w:tcPr>
+          <w:p>
+            <w:pPr>
+              <w:jc w:val="center"/>
+            </w:pPr>
+            <w:r>
+              <w:rPr>
+                <w:b/>
+                <w:color w:val="FFFFFF"/>
+                <w:sz w:val="19"/>
+              </w:rPr>
+              <w:t>Variable</w:t>
+            </w:r>
+          </w:p>
+        </w:tc>
+        <w:tc>
+          <w:tcPr>
+            <w:tcW w:type="dxa" w:w="1560"/>
+            <w:shd w:fill="1F4E79"/>
+            <w:tcMar>
+              <w:top w:w="100" w:type="dxa"/>
+              <w:bottom w:w="100" w:type="dxa"/>
+              <w:left w:w="120" w:type="dxa"/>
+              <w:right w:w="120" w:type="dxa"/>
+            </w:tcMar>
+          </w:tcPr>
+          <w:p>
+            <w:pPr>
+              <w:jc w:val="center"/>
+            </w:pPr>
+            <w:r>
+              <w:rPr>
+                <w:b/>
+                <w:color w:val="FFFFFF"/>
+                <w:sz w:val="19"/>
+              </w:rPr>
+              <w:t>Descripción</w:t>
+            </w:r>
+          </w:p>
+        </w:tc>
+        <w:tc>
+          <w:tcPr>
+            <w:tcW w:type="dxa" w:w="1560"/>
+            <w:shd w:fill="1F4E79"/>
+            <w:tcMar>
+              <w:top w:w="100" w:type="dxa"/>
+              <w:bottom w:w="100" w:type="dxa"/>
+              <w:left w:w="120" w:type="dxa"/>
+              <w:right w:w="120" w:type="dxa"/>
+            </w:tcMar>
+          </w:tcPr>
+          <w:p>
+            <w:pPr>
+              <w:jc w:val="center"/>
+            </w:pPr>
+            <w:r>
+              <w:rPr>
+                <w:b/>
+                <w:color w:val="FFFFFF"/>
+                <w:sz w:val="19"/>
+              </w:rPr>
+              <w:t>U.M.</w:t>
+            </w:r>
+          </w:p>
+        </w:tc>
+        <w:tc>
+          <w:tcPr>
+            <w:tcW w:type="dxa" w:w="1560"/>
+            <w:shd w:fill="1F4E79"/>
+            <w:tcMar>
+              <w:top w:w="100" w:type="dxa"/>
+              <w:bottom w:w="100" w:type="dxa"/>
+              <w:left w:w="120" w:type="dxa"/>
+              <w:right w:w="120" w:type="dxa"/>
+            </w:tcMar>
+          </w:tcPr>
+          <w:p>
+            <w:pPr>
+              <w:jc w:val="center"/>
+            </w:pPr>
+            <w:r>
+              <w:rPr>
+                <w:b/>
+                <w:color w:val="FFFFFF"/>
+                <w:sz w:val="19"/>
+              </w:rPr>
+              <w:t>Valor / Rango</w:t>
+            </w:r>
+          </w:p>
+        </w:tc>
+        <w:tc>
+          <w:tcPr>
+            <w:tcW w:type="dxa" w:w="1560"/>
+            <w:shd w:fill="1F4E79"/>
+            <w:tcMar>
+              <w:top w:w="100" w:type="dxa"/>
+              <w:bottom w:w="100" w:type="dxa"/>
+              <w:left w:w="120" w:type="dxa"/>
+              <w:right w:w="120" w:type="dxa"/>
+            </w:tcMar>
+          </w:tcPr>
+          <w:p>
+            <w:pPr>
+              <w:jc w:val="center"/>
+            </w:pPr>
+            <w:r>
+              <w:rPr>
+                <w:b/>
+                <w:color w:val="FFFFFF"/>
+                <w:sz w:val="19"/>
+              </w:rPr>
+              <w:t>Relación / Expresión</w:t>
+            </w:r>
+          </w:p>
+        </w:tc>
+        <w:tc>
+          <w:tcPr>
+            <w:tcW w:type="dxa" w:w="1560"/>
+            <w:shd w:fill="1F4E79"/>
+            <w:tcMar>
+              <w:top w:w="100" w:type="dxa"/>
+              <w:bottom w:w="100" w:type="dxa"/>
+              <w:left w:w="120" w:type="dxa"/>
+              <w:right w:w="120" w:type="dxa"/>
+            </w:tcMar>
+          </w:tcPr>
+          <w:p>
+            <w:pPr>
+              <w:jc w:val="center"/>
+            </w:pPr>
+            <w:r>
+              <w:rPr>
+                <w:b/>
+                <w:color w:val="FFFFFF"/>
+                <w:sz w:val="19"/>
+              </w:rPr>
+              <w:t>Característica</w:t>
+            </w:r>
+          </w:p>
+        </w:tc>
+      </w:tr>
+      <w:tr>
+        <w:tc>
+          <w:tcPr>
+            <w:tcW w:type="dxa" w:w="1560"/>
+            <w:shd w:fill="F2F5F9"/>
+            <w:tcMar>
+              <w:top w:w="60" w:type="dxa"/>
+              <w:bottom w:w="60" w:type="dxa"/>
+              <w:left w:w="100" w:type="dxa"/>
+              <w:right w:w="100" w:type="dxa"/>
+            </w:tcMar>
+          </w:tcPr>
+          <w:p>
+            <w:r>
+              <w:rPr>
+                <w:sz w:val="18"/>
+              </w:rPr>
+              <w:t>lambda</w:t>
+            </w:r>
+          </w:p>
+        </w:tc>
+        <w:tc>
+          <w:tcPr>
+            <w:tcW w:type="dxa" w:w="1560"/>
+            <w:shd w:fill="F2F5F9"/>
+            <w:tcMar>
+              <w:top w:w="60" w:type="dxa"/>
+              <w:bottom w:w="60" w:type="dxa"/>
+              <w:left w:w="100" w:type="dxa"/>
+              <w:right w:w="100" w:type="dxa"/>
+            </w:tcMar>
+          </w:tcPr>
+          <w:p>
+            <w:r>
+              <w:rPr>
+                <w:sz w:val="18"/>
+              </w:rPr>
+              <w:t>Tasa de arribo buques feeder</w:t>
+            </w:r>
+          </w:p>
+        </w:tc>
+        <w:tc>
+          <w:tcPr>
+            <w:tcW w:type="dxa" w:w="1560"/>
+            <w:shd w:fill="F2F5F9"/>
+            <w:tcMar>
+              <w:top w:w="60" w:type="dxa"/>
+              <w:bottom w:w="60" w:type="dxa"/>
+              <w:left w:w="100" w:type="dxa"/>
+              <w:right w:w="100" w:type="dxa"/>
+            </w:tcMar>
+          </w:tcPr>
+          <w:p>
+            <w:r>
+              <w:rPr>
+                <w:sz w:val="18"/>
+              </w:rPr>
+              <w:t>buques/día</w:t>
+            </w:r>
+          </w:p>
+        </w:tc>
+        <w:tc>
+          <w:tcPr>
+            <w:tcW w:type="dxa" w:w="1560"/>
+            <w:shd w:fill="F2F5F9"/>
+            <w:tcMar>
+              <w:top w:w="60" w:type="dxa"/>
+              <w:bottom w:w="60" w:type="dxa"/>
+              <w:left w:w="100" w:type="dxa"/>
+              <w:right w:w="100" w:type="dxa"/>
+            </w:tcMar>
+          </w:tcPr>
+          <w:p>
+            <w:r>
+              <w:rPr>
+                <w:sz w:val="18"/>
+              </w:rPr>
+              <w:t>8.09 b/d</w:t>
+            </w:r>
+          </w:p>
+        </w:tc>
+        <w:tc>
+          <w:tcPr>
+            <w:tcW w:type="dxa" w:w="1560"/>
+            <w:shd w:fill="F2F5F9"/>
+            <w:tcMar>
+              <w:top w:w="60" w:type="dxa"/>
+              <w:bottom w:w="60" w:type="dxa"/>
+              <w:left w:w="100" w:type="dxa"/>
+              <w:right w:w="100" w:type="dxa"/>
+            </w:tcMar>
+          </w:tcPr>
+          <w:p>
+            <w:r>
+              <w:rPr>
+                <w:sz w:val="18"/>
+              </w:rPr>
+              <w:t>Histórico escalas G08</w:t>
+            </w:r>
+          </w:p>
+        </w:tc>
+        <w:tc>
+          <w:tcPr>
+            <w:tcW w:type="dxa" w:w="1560"/>
+            <w:shd w:fill="F2F5F9"/>
+            <w:tcMar>
+              <w:top w:w="60" w:type="dxa"/>
+              <w:bottom w:w="60" w:type="dxa"/>
+              <w:left w:w="100" w:type="dxa"/>
+              <w:right w:w="100" w:type="dxa"/>
+            </w:tcMar>
+          </w:tcPr>
+          <w:p>
+            <w:r>
+              <w:rPr>
+                <w:sz w:val="18"/>
+              </w:rPr>
+              <w:t>Poisson no homogéneo (Delta t ~ Exp(2.97h))</w:t>
+            </w:r>
+          </w:p>
+        </w:tc>
+      </w:tr>
+      <w:tr>
+        <w:tc>
+          <w:tcPr>
+            <w:tcW w:type="dxa" w:w="1560"/>
+            <w:tcMar>
+              <w:top w:w="60" w:type="dxa"/>
+              <w:bottom w:w="60" w:type="dxa"/>
+              <w:left w:w="100" w:type="dxa"/>
+              <w:right w:w="100" w:type="dxa"/>
+            </w:tcMar>
+          </w:tcPr>
+          <w:p>
+            <w:r>
+              <w:rPr>
+                <w:sz w:val="18"/>
+              </w:rPr>
+              <w:t>Mix</w:t>
+            </w:r>
+          </w:p>
+        </w:tc>
+        <w:tc>
+          <w:tcPr>
+            <w:tcW w:type="dxa" w:w="1560"/>
+            <w:tcMar>
+              <w:top w:w="60" w:type="dxa"/>
+              <w:bottom w:w="60" w:type="dxa"/>
+              <w:left w:w="100" w:type="dxa"/>
+              <w:right w:w="100" w:type="dxa"/>
+            </w:tcMar>
+          </w:tcPr>
+          <w:p>
+            <w:r>
+              <w:rPr>
+                <w:sz w:val="18"/>
+              </w:rPr>
+              <w:t>Composición de carga por escala</w:t>
+            </w:r>
+          </w:p>
+        </w:tc>
+        <w:tc>
+          <w:tcPr>
+            <w:tcW w:type="dxa" w:w="1560"/>
+            <w:tcMar>
+              <w:top w:w="60" w:type="dxa"/>
+              <w:bottom w:w="60" w:type="dxa"/>
+              <w:left w:w="100" w:type="dxa"/>
+              <w:right w:w="100" w:type="dxa"/>
+            </w:tcMar>
+          </w:tcPr>
+          <w:p>
+            <w:r>
+              <w:rPr>
+                <w:sz w:val="18"/>
+              </w:rPr>
+              <w:t>% mov</w:t>
+            </w:r>
+          </w:p>
+        </w:tc>
+        <w:tc>
+          <w:tcPr>
+            <w:tcW w:type="dxa" w:w="1560"/>
+            <w:tcMar>
+              <w:top w:w="60" w:type="dxa"/>
+              <w:bottom w:w="60" w:type="dxa"/>
+              <w:left w:w="100" w:type="dxa"/>
+              <w:right w:w="100" w:type="dxa"/>
+            </w:tcMar>
+          </w:tcPr>
+          <w:p>
+            <w:r>
+              <w:rPr>
+                <w:sz w:val="18"/>
+              </w:rPr>
+              <w:t>55% Dry, 35% Reefer, 10% OOG</w:t>
+            </w:r>
+          </w:p>
+        </w:tc>
+        <w:tc>
+          <w:tcPr>
+            <w:tcW w:type="dxa" w:w="1560"/>
+            <w:tcMar>
+              <w:top w:w="60" w:type="dxa"/>
+              <w:bottom w:w="60" w:type="dxa"/>
+              <w:left w:w="100" w:type="dxa"/>
+              <w:right w:w="100" w:type="dxa"/>
+            </w:tcMar>
+          </w:tcPr>
+          <w:p>
+            <w:r>
+              <w:rPr>
+                <w:sz w:val="18"/>
+              </w:rPr>
+              <w:t>8.852 escalas G08</w:t>
+            </w:r>
+          </w:p>
+        </w:tc>
+        <w:tc>
+          <w:tcPr>
+            <w:tcW w:type="dxa" w:w="1560"/>
+            <w:tcMar>
+              <w:top w:w="60" w:type="dxa"/>
+              <w:bottom w:w="60" w:type="dxa"/>
+              <w:left w:w="100" w:type="dxa"/>
+              <w:right w:w="100" w:type="dxa"/>
+            </w:tcMar>
+          </w:tcPr>
+          <w:p>
+            <w:r>
+              <w:rPr>
+                <w:sz w:val="18"/>
+              </w:rPr>
+              <w:t>Empírica por servicio</w:t>
+            </w:r>
+          </w:p>
+        </w:tc>
+      </w:tr>
+      <w:tr>
+        <w:tc>
+          <w:tcPr>
+            <w:tcW w:type="dxa" w:w="1560"/>
+            <w:shd w:fill="F2F5F9"/>
+            <w:tcMar>
+              <w:top w:w="60" w:type="dxa"/>
+              <w:bottom w:w="60" w:type="dxa"/>
+              <w:left w:w="100" w:type="dxa"/>
+              <w:right w:w="100" w:type="dxa"/>
+            </w:tcMar>
+          </w:tcPr>
+          <w:p>
+            <w:r>
+              <w:rPr>
+                <w:sz w:val="18"/>
+              </w:rPr>
+              <w:t>mu_dry</w:t>
+            </w:r>
+          </w:p>
+        </w:tc>
+        <w:tc>
+          <w:tcPr>
+            <w:tcW w:type="dxa" w:w="1560"/>
+            <w:shd w:fill="F2F5F9"/>
+            <w:tcMar>
+              <w:top w:w="60" w:type="dxa"/>
+              <w:bottom w:w="60" w:type="dxa"/>
+              <w:left w:w="100" w:type="dxa"/>
+              <w:right w:w="100" w:type="dxa"/>
+            </w:tcMar>
+          </w:tcPr>
+          <w:p>
+            <w:r>
+              <w:rPr>
+                <w:sz w:val="18"/>
+              </w:rPr>
+              <w:t>Rendimiento grúa Dry</w:t>
+            </w:r>
+          </w:p>
+        </w:tc>
+        <w:tc>
+          <w:tcPr>
+            <w:tcW w:type="dxa" w:w="1560"/>
+            <w:shd w:fill="F2F5F9"/>
+            <w:tcMar>
+              <w:top w:w="60" w:type="dxa"/>
+              <w:bottom w:w="60" w:type="dxa"/>
+              <w:left w:w="100" w:type="dxa"/>
+              <w:right w:w="100" w:type="dxa"/>
+            </w:tcMar>
+          </w:tcPr>
+          <w:p>
+            <w:r>
+              <w:rPr>
+                <w:sz w:val="18"/>
+              </w:rPr>
+              <w:t>mov/hora</w:t>
+            </w:r>
+          </w:p>
+        </w:tc>
+        <w:tc>
+          <w:tcPr>
+            <w:tcW w:type="dxa" w:w="1560"/>
+            <w:shd w:fill="F2F5F9"/>
+            <w:tcMar>
+              <w:top w:w="60" w:type="dxa"/>
+              <w:bottom w:w="60" w:type="dxa"/>
+              <w:left w:w="100" w:type="dxa"/>
+              <w:right w:w="100" w:type="dxa"/>
+            </w:tcMar>
+          </w:tcPr>
+          <w:p>
+            <w:r>
+              <w:rPr>
+                <w:sz w:val="18"/>
+              </w:rPr>
+              <w:t>28</w:t>
+            </w:r>
+          </w:p>
+        </w:tc>
+        <w:tc>
+          <w:tcPr>
+            <w:tcW w:type="dxa" w:w="1560"/>
+            <w:shd w:fill="F2F5F9"/>
+            <w:tcMar>
+              <w:top w:w="60" w:type="dxa"/>
+              <w:bottom w:w="60" w:type="dxa"/>
+              <w:left w:w="100" w:type="dxa"/>
+              <w:right w:w="100" w:type="dxa"/>
+            </w:tcMar>
+          </w:tcPr>
+          <w:p>
+            <w:r>
+              <w:rPr>
+                <w:sz w:val="18"/>
+              </w:rPr>
+              <w:t>Tasa nominal directa</w:t>
+            </w:r>
+          </w:p>
+        </w:tc>
+        <w:tc>
+          <w:tcPr>
+            <w:tcW w:type="dxa" w:w="1560"/>
+            <w:shd w:fill="F2F5F9"/>
+            <w:tcMar>
+              <w:top w:w="60" w:type="dxa"/>
+              <w:bottom w:w="60" w:type="dxa"/>
+              <w:left w:w="100" w:type="dxa"/>
+              <w:right w:w="100" w:type="dxa"/>
+            </w:tcMar>
+          </w:tcPr>
+          <w:p>
+            <w:r>
+              <w:rPr>
+                <w:sz w:val="18"/>
+              </w:rPr>
+              <w:t>Determinística</w:t>
+            </w:r>
+          </w:p>
+        </w:tc>
+      </w:tr>
+      <w:tr>
+        <w:tc>
+          <w:tcPr>
+            <w:tcW w:type="dxa" w:w="1560"/>
+            <w:tcMar>
+              <w:top w:w="60" w:type="dxa"/>
+              <w:bottom w:w="60" w:type="dxa"/>
+              <w:left w:w="100" w:type="dxa"/>
+              <w:right w:w="100" w:type="dxa"/>
+            </w:tcMar>
+          </w:tcPr>
+          <w:p>
+            <w:r>
+              <w:rPr>
+                <w:sz w:val="18"/>
+              </w:rPr>
+              <w:t>mu_reefer</w:t>
+            </w:r>
+          </w:p>
+        </w:tc>
+        <w:tc>
+          <w:tcPr>
+            <w:tcW w:type="dxa" w:w="1560"/>
+            <w:tcMar>
+              <w:top w:w="60" w:type="dxa"/>
+              <w:bottom w:w="60" w:type="dxa"/>
+              <w:left w:w="100" w:type="dxa"/>
+              <w:right w:w="100" w:type="dxa"/>
+            </w:tcMar>
+          </w:tcPr>
+          <w:p>
+            <w:r>
+              <w:rPr>
+                <w:sz w:val="18"/>
+              </w:rPr>
+              <w:t>Rendimiento grúa Reefer</w:t>
+            </w:r>
+          </w:p>
+        </w:tc>
+        <w:tc>
+          <w:tcPr>
+            <w:tcW w:type="dxa" w:w="1560"/>
+            <w:tcMar>
+              <w:top w:w="60" w:type="dxa"/>
+              <w:bottom w:w="60" w:type="dxa"/>
+              <w:left w:w="100" w:type="dxa"/>
+              <w:right w:w="100" w:type="dxa"/>
+            </w:tcMar>
+          </w:tcPr>
+          <w:p>
+            <w:r>
+              <w:rPr>
+                <w:sz w:val="18"/>
+              </w:rPr>
+              <w:t>mov/hora</w:t>
+            </w:r>
+          </w:p>
+        </w:tc>
+        <w:tc>
+          <w:tcPr>
+            <w:tcW w:type="dxa" w:w="1560"/>
+            <w:tcMar>
+              <w:top w:w="60" w:type="dxa"/>
+              <w:bottom w:w="60" w:type="dxa"/>
+              <w:left w:w="100" w:type="dxa"/>
+              <w:right w:w="100" w:type="dxa"/>
+            </w:tcMar>
+          </w:tcPr>
+          <w:p>
+            <w:r>
+              <w:rPr>
+                <w:sz w:val="18"/>
+              </w:rPr>
+              <w:t>21</w:t>
+            </w:r>
+          </w:p>
+        </w:tc>
+        <w:tc>
+          <w:tcPr>
+            <w:tcW w:type="dxa" w:w="1560"/>
+            <w:tcMar>
+              <w:top w:w="60" w:type="dxa"/>
+              <w:bottom w:w="60" w:type="dxa"/>
+              <w:left w:w="100" w:type="dxa"/>
+              <w:right w:w="100" w:type="dxa"/>
+            </w:tcMar>
+          </w:tcPr>
+          <w:p>
+            <w:r>
+              <w:rPr>
+                <w:sz w:val="18"/>
+              </w:rPr>
+              <w:t>mu_dry * 0.75 (-25%)</w:t>
+            </w:r>
+          </w:p>
+        </w:tc>
+        <w:tc>
+          <w:tcPr>
+            <w:tcW w:type="dxa" w:w="1560"/>
+            <w:tcMar>
+              <w:top w:w="60" w:type="dxa"/>
+              <w:bottom w:w="60" w:type="dxa"/>
+              <w:left w:w="100" w:type="dxa"/>
+              <w:right w:w="100" w:type="dxa"/>
+            </w:tcMar>
+          </w:tcPr>
+          <w:p>
+            <w:r>
+              <w:rPr>
+                <w:sz w:val="18"/>
+              </w:rPr>
+              <w:t>Determinística</w:t>
+            </w:r>
+          </w:p>
+        </w:tc>
+      </w:tr>
+      <w:tr>
+        <w:tc>
+          <w:tcPr>
+            <w:tcW w:type="dxa" w:w="1560"/>
+            <w:shd w:fill="F2F5F9"/>
+            <w:tcMar>
+              <w:top w:w="60" w:type="dxa"/>
+              <w:bottom w:w="60" w:type="dxa"/>
+              <w:left w:w="100" w:type="dxa"/>
+              <w:right w:w="100" w:type="dxa"/>
+            </w:tcMar>
+          </w:tcPr>
+          <w:p>
+            <w:r>
+              <w:rPr>
+                <w:sz w:val="18"/>
+              </w:rPr>
+              <w:t>mu_oog</w:t>
+            </w:r>
+          </w:p>
+        </w:tc>
+        <w:tc>
+          <w:tcPr>
+            <w:tcW w:type="dxa" w:w="1560"/>
+            <w:shd w:fill="F2F5F9"/>
+            <w:tcMar>
+              <w:top w:w="60" w:type="dxa"/>
+              <w:bottom w:w="60" w:type="dxa"/>
+              <w:left w:w="100" w:type="dxa"/>
+              <w:right w:w="100" w:type="dxa"/>
+            </w:tcMar>
+          </w:tcPr>
+          <w:p>
+            <w:r>
+              <w:rPr>
+                <w:sz w:val="18"/>
+              </w:rPr>
+              <w:t>Rendimiento grúa OOG</w:t>
+            </w:r>
+          </w:p>
+        </w:tc>
+        <w:tc>
+          <w:tcPr>
+            <w:tcW w:type="dxa" w:w="1560"/>
+            <w:shd w:fill="F2F5F9"/>
+            <w:tcMar>
+              <w:top w:w="60" w:type="dxa"/>
+              <w:bottom w:w="60" w:type="dxa"/>
+              <w:left w:w="100" w:type="dxa"/>
+              <w:right w:w="100" w:type="dxa"/>
+            </w:tcMar>
+          </w:tcPr>
+          <w:p>
+            <w:r>
+              <w:rPr>
+                <w:sz w:val="18"/>
+              </w:rPr>
+              <w:t>mov/hora</w:t>
+            </w:r>
+          </w:p>
+        </w:tc>
+        <w:tc>
+          <w:tcPr>
+            <w:tcW w:type="dxa" w:w="1560"/>
+            <w:shd w:fill="F2F5F9"/>
+            <w:tcMar>
+              <w:top w:w="60" w:type="dxa"/>
+              <w:bottom w:w="60" w:type="dxa"/>
+              <w:left w:w="100" w:type="dxa"/>
+              <w:right w:w="100" w:type="dxa"/>
+            </w:tcMar>
+          </w:tcPr>
+          <w:p>
+            <w:r>
+              <w:rPr>
+                <w:sz w:val="18"/>
+              </w:rPr>
+              <w:t>12</w:t>
+            </w:r>
+          </w:p>
+        </w:tc>
+        <w:tc>
+          <w:tcPr>
+            <w:tcW w:type="dxa" w:w="1560"/>
+            <w:shd w:fill="F2F5F9"/>
+            <w:tcMar>
+              <w:top w:w="60" w:type="dxa"/>
+              <w:bottom w:w="60" w:type="dxa"/>
+              <w:left w:w="100" w:type="dxa"/>
+              <w:right w:w="100" w:type="dxa"/>
+            </w:tcMar>
+          </w:tcPr>
+          <w:p>
+            <w:r>
+              <w:rPr>
+                <w:sz w:val="18"/>
+              </w:rPr>
+              <w:t>Aparejos especiales</w:t>
+            </w:r>
+          </w:p>
+        </w:tc>
+        <w:tc>
+          <w:tcPr>
+            <w:tcW w:type="dxa" w:w="1560"/>
+            <w:shd w:fill="F2F5F9"/>
+            <w:tcMar>
+              <w:top w:w="60" w:type="dxa"/>
+              <w:bottom w:w="60" w:type="dxa"/>
+              <w:left w:w="100" w:type="dxa"/>
+              <w:right w:w="100" w:type="dxa"/>
+            </w:tcMar>
+          </w:tcPr>
+          <w:p>
+            <w:r>
+              <w:rPr>
+                <w:sz w:val="18"/>
+              </w:rPr>
+              <w:t>Determinística</w:t>
+            </w:r>
+          </w:p>
+        </w:tc>
+      </w:tr>
+      <w:tr>
+        <w:tc>
+          <w:tcPr>
+            <w:tcW w:type="dxa" w:w="1560"/>
+            <w:tcMar>
+              <w:top w:w="60" w:type="dxa"/>
+              <w:bottom w:w="60" w:type="dxa"/>
+              <w:left w:w="100" w:type="dxa"/>
+              <w:right w:w="100" w:type="dxa"/>
+            </w:tcMar>
+          </w:tcPr>
+          <w:p>
+            <w:r>
+              <w:rPr>
+                <w:sz w:val="18"/>
+              </w:rPr>
+              <w:t>eta</w:t>
+            </w:r>
+          </w:p>
+        </w:tc>
+        <w:tc>
+          <w:tcPr>
+            <w:tcW w:type="dxa" w:w="1560"/>
+            <w:tcMar>
+              <w:top w:w="60" w:type="dxa"/>
+              <w:bottom w:w="60" w:type="dxa"/>
+              <w:left w:w="100" w:type="dxa"/>
+              <w:right w:w="100" w:type="dxa"/>
+            </w:tcMar>
+          </w:tcPr>
+          <w:p>
+            <w:r>
+              <w:rPr>
+                <w:sz w:val="18"/>
+              </w:rPr>
+              <w:t>Factor interferencia doble grúa</w:t>
+            </w:r>
+          </w:p>
+        </w:tc>
+        <w:tc>
+          <w:tcPr>
+            <w:tcW w:type="dxa" w:w="1560"/>
+            <w:tcMar>
+              <w:top w:w="60" w:type="dxa"/>
+              <w:bottom w:w="60" w:type="dxa"/>
+              <w:left w:w="100" w:type="dxa"/>
+              <w:right w:w="100" w:type="dxa"/>
+            </w:tcMar>
+          </w:tcPr>
+          <w:p>
+            <w:r>
+              <w:rPr>
+                <w:sz w:val="18"/>
+              </w:rPr>
+              <w:t>factor</w:t>
+            </w:r>
+          </w:p>
+        </w:tc>
+        <w:tc>
+          <w:tcPr>
+            <w:tcW w:type="dxa" w:w="1560"/>
+            <w:tcMar>
+              <w:top w:w="60" w:type="dxa"/>
+              <w:bottom w:w="60" w:type="dxa"/>
+              <w:left w:w="100" w:type="dxa"/>
+              <w:right w:w="100" w:type="dxa"/>
+            </w:tcMar>
+          </w:tcPr>
+          <w:p>
+            <w:r>
+              <w:rPr>
+                <w:sz w:val="18"/>
+              </w:rPr>
+              <w:t>0.85</w:t>
+            </w:r>
+          </w:p>
+        </w:tc>
+        <w:tc>
+          <w:tcPr>
+            <w:tcW w:type="dxa" w:w="1560"/>
+            <w:tcMar>
+              <w:top w:w="60" w:type="dxa"/>
+              <w:bottom w:w="60" w:type="dxa"/>
+              <w:left w:w="100" w:type="dxa"/>
+              <w:right w:w="100" w:type="dxa"/>
+            </w:tcMar>
+          </w:tcPr>
+          <w:p>
+            <w:r>
+              <w:rPr>
+                <w:sz w:val="18"/>
+              </w:rPr>
+              <w:t>Prod. combinada = 1.7x</w:t>
+            </w:r>
+          </w:p>
+        </w:tc>
+        <w:tc>
+          <w:tcPr>
+            <w:tcW w:type="dxa" w:w="1560"/>
+            <w:tcMar>
+              <w:top w:w="60" w:type="dxa"/>
+              <w:bottom w:w="60" w:type="dxa"/>
+              <w:left w:w="100" w:type="dxa"/>
+              <w:right w:w="100" w:type="dxa"/>
+            </w:tcMar>
+          </w:tcPr>
+          <w:p>
+            <w:r>
+              <w:rPr>
+                <w:sz w:val="18"/>
+              </w:rPr>
+              <w:t>Determinística</w:t>
+            </w:r>
+          </w:p>
+        </w:tc>
+      </w:tr>
+      <w:tr>
+        <w:tc>
+          <w:tcPr>
+            <w:tcW w:type="dxa" w:w="1560"/>
+            <w:shd w:fill="F2F5F9"/>
+            <w:tcMar>
+              <w:top w:w="60" w:type="dxa"/>
+              <w:bottom w:w="60" w:type="dxa"/>
+              <w:left w:w="100" w:type="dxa"/>
+              <w:right w:w="100" w:type="dxa"/>
+            </w:tcMar>
+          </w:tcPr>
+          <w:p>
+            <w:r>
+              <w:rPr>
+                <w:sz w:val="18"/>
+              </w:rPr>
+              <w:t>T_maniobra</w:t>
+            </w:r>
+          </w:p>
+        </w:tc>
+        <w:tc>
+          <w:tcPr>
+            <w:tcW w:type="dxa" w:w="1560"/>
+            <w:shd w:fill="F2F5F9"/>
+            <w:tcMar>
+              <w:top w:w="60" w:type="dxa"/>
+              <w:bottom w:w="60" w:type="dxa"/>
+              <w:left w:w="100" w:type="dxa"/>
+              <w:right w:w="100" w:type="dxa"/>
+            </w:tcMar>
+          </w:tcPr>
+          <w:p>
+            <w:r>
+              <w:rPr>
+                <w:sz w:val="18"/>
+              </w:rPr>
+              <w:t>Maniobras atraque + desatraque</w:t>
+            </w:r>
+          </w:p>
+        </w:tc>
+        <w:tc>
+          <w:tcPr>
+            <w:tcW w:type="dxa" w:w="1560"/>
+            <w:shd w:fill="F2F5F9"/>
+            <w:tcMar>
+              <w:top w:w="60" w:type="dxa"/>
+              <w:bottom w:w="60" w:type="dxa"/>
+              <w:left w:w="100" w:type="dxa"/>
+              <w:right w:w="100" w:type="dxa"/>
+            </w:tcMar>
+          </w:tcPr>
+          <w:p>
+            <w:r>
+              <w:rPr>
+                <w:sz w:val="18"/>
+              </w:rPr>
+              <w:t>horas</w:t>
+            </w:r>
+          </w:p>
+        </w:tc>
+        <w:tc>
+          <w:tcPr>
+            <w:tcW w:type="dxa" w:w="1560"/>
+            <w:shd w:fill="F2F5F9"/>
+            <w:tcMar>
+              <w:top w:w="60" w:type="dxa"/>
+              <w:bottom w:w="60" w:type="dxa"/>
+              <w:left w:w="100" w:type="dxa"/>
+              <w:right w:w="100" w:type="dxa"/>
+            </w:tcMar>
+          </w:tcPr>
+          <w:p>
+            <w:r>
+              <w:rPr>
+                <w:sz w:val="18"/>
+              </w:rPr>
+              <w:t>[1.0, 2.0]</w:t>
+            </w:r>
+          </w:p>
+        </w:tc>
+        <w:tc>
+          <w:tcPr>
+            <w:tcW w:type="dxa" w:w="1560"/>
+            <w:shd w:fill="F2F5F9"/>
+            <w:tcMar>
+              <w:top w:w="60" w:type="dxa"/>
+              <w:bottom w:w="60" w:type="dxa"/>
+              <w:left w:w="100" w:type="dxa"/>
+              <w:right w:w="100" w:type="dxa"/>
+            </w:tcMar>
+          </w:tcPr>
+          <w:p>
+            <w:r>
+              <w:rPr>
+                <w:sz w:val="18"/>
+              </w:rPr>
+              <w:t>Conjunto entre 1 y 2 h</w:t>
+            </w:r>
+          </w:p>
+        </w:tc>
+        <w:tc>
+          <w:tcPr>
+            <w:tcW w:type="dxa" w:w="1560"/>
+            <w:shd w:fill="F2F5F9"/>
+            <w:tcMar>
+              <w:top w:w="60" w:type="dxa"/>
+              <w:bottom w:w="60" w:type="dxa"/>
+              <w:left w:w="100" w:type="dxa"/>
+              <w:right w:w="100" w:type="dxa"/>
+            </w:tcMar>
+          </w:tcPr>
+          <w:p>
+            <w:r>
+              <w:rPr>
+                <w:sz w:val="18"/>
+              </w:rPr>
+              <w:t>Aleatoria U(1.0, 2.0) h (media 1.5h)</w:t>
+            </w:r>
+          </w:p>
+        </w:tc>
+      </w:tr>
+      <w:tr>
+        <w:tc>
+          <w:tcPr>
+            <w:tcW w:type="dxa" w:w="1560"/>
+            <w:tcMar>
+              <w:top w:w="60" w:type="dxa"/>
+              <w:bottom w:w="60" w:type="dxa"/>
+              <w:left w:w="100" w:type="dxa"/>
+              <w:right w:w="100" w:type="dxa"/>
+            </w:tcMar>
+          </w:tcPr>
+          <w:p>
+            <w:r>
+              <w:rPr>
+                <w:sz w:val="18"/>
+              </w:rPr>
+              <w:t>T_cambio</w:t>
+            </w:r>
+          </w:p>
+        </w:tc>
+        <w:tc>
+          <w:tcPr>
+            <w:tcW w:type="dxa" w:w="1560"/>
+            <w:tcMar>
+              <w:top w:w="60" w:type="dxa"/>
+              <w:bottom w:w="60" w:type="dxa"/>
+              <w:left w:w="100" w:type="dxa"/>
+              <w:right w:w="100" w:type="dxa"/>
+            </w:tcMar>
+          </w:tcPr>
+          <w:p>
+            <w:r>
+              <w:rPr>
+                <w:sz w:val="18"/>
+              </w:rPr>
+              <w:t>Paradas de cambio de guardia</w:t>
+            </w:r>
+          </w:p>
+        </w:tc>
+        <w:tc>
+          <w:tcPr>
+            <w:tcW w:type="dxa" w:w="1560"/>
+            <w:tcMar>
+              <w:top w:w="60" w:type="dxa"/>
+              <w:bottom w:w="60" w:type="dxa"/>
+              <w:left w:w="100" w:type="dxa"/>
+              <w:right w:w="100" w:type="dxa"/>
+            </w:tcMar>
+          </w:tcPr>
+          <w:p>
+            <w:r>
+              <w:rPr>
+                <w:sz w:val="18"/>
+              </w:rPr>
+              <w:t>minutos</w:t>
+            </w:r>
+          </w:p>
+        </w:tc>
+        <w:tc>
+          <w:tcPr>
+            <w:tcW w:type="dxa" w:w="1560"/>
+            <w:tcMar>
+              <w:top w:w="60" w:type="dxa"/>
+              <w:bottom w:w="60" w:type="dxa"/>
+              <w:left w:w="100" w:type="dxa"/>
+              <w:right w:w="100" w:type="dxa"/>
+            </w:tcMar>
+          </w:tcPr>
+          <w:p>
+            <w:r>
+              <w:rPr>
+                <w:sz w:val="18"/>
+              </w:rPr>
+              <w:t>[10, 15]</w:t>
+            </w:r>
+          </w:p>
+        </w:tc>
+        <w:tc>
+          <w:tcPr>
+            <w:tcW w:type="dxa" w:w="1560"/>
+            <w:tcMar>
+              <w:top w:w="60" w:type="dxa"/>
+              <w:bottom w:w="60" w:type="dxa"/>
+              <w:left w:w="100" w:type="dxa"/>
+              <w:right w:w="100" w:type="dxa"/>
+            </w:tcMar>
+          </w:tcPr>
+          <w:p>
+            <w:r>
+              <w:rPr>
+                <w:sz w:val="18"/>
+              </w:rPr>
+              <w:t>Cada 8h (00, 08, 16h)</w:t>
+            </w:r>
+          </w:p>
+        </w:tc>
+        <w:tc>
+          <w:tcPr>
+            <w:tcW w:type="dxa" w:w="1560"/>
+            <w:tcMar>
+              <w:top w:w="60" w:type="dxa"/>
+              <w:bottom w:w="60" w:type="dxa"/>
+              <w:left w:w="100" w:type="dxa"/>
+              <w:right w:w="100" w:type="dxa"/>
+            </w:tcMar>
+          </w:tcPr>
+          <w:p>
+            <w:r>
+              <w:rPr>
+                <w:sz w:val="18"/>
+              </w:rPr>
+              <w:t>Aleatoria U(10, 15) min</w:t>
+            </w:r>
+          </w:p>
+        </w:tc>
+      </w:tr>
+      <w:tr>
+        <w:tc>
+          <w:tcPr>
+            <w:tcW w:type="dxa" w:w="1560"/>
+            <w:shd w:fill="F2F5F9"/>
+            <w:tcMar>
+              <w:top w:w="60" w:type="dxa"/>
+              <w:bottom w:w="60" w:type="dxa"/>
+              <w:left w:w="100" w:type="dxa"/>
+              <w:right w:w="100" w:type="dxa"/>
+            </w:tcMar>
+          </w:tcPr>
+          <w:p>
+            <w:r>
+              <w:rPr>
+                <w:sz w:val="18"/>
+              </w:rPr>
+              <w:t>Cap_patio</w:t>
+            </w:r>
+          </w:p>
+        </w:tc>
+        <w:tc>
+          <w:tcPr>
+            <w:tcW w:type="dxa" w:w="1560"/>
+            <w:shd w:fill="F2F5F9"/>
+            <w:tcMar>
+              <w:top w:w="60" w:type="dxa"/>
+              <w:bottom w:w="60" w:type="dxa"/>
+              <w:left w:w="100" w:type="dxa"/>
+              <w:right w:w="100" w:type="dxa"/>
+            </w:tcMar>
+          </w:tcPr>
+          <w:p>
+            <w:r>
+              <w:rPr>
+                <w:sz w:val="18"/>
+              </w:rPr>
+              <w:t>Capacidad estática patio</w:t>
+            </w:r>
+          </w:p>
+        </w:tc>
+        <w:tc>
+          <w:tcPr>
+            <w:tcW w:type="dxa" w:w="1560"/>
+            <w:shd w:fill="F2F5F9"/>
+            <w:tcMar>
+              <w:top w:w="60" w:type="dxa"/>
+              <w:bottom w:w="60" w:type="dxa"/>
+              <w:left w:w="100" w:type="dxa"/>
+              <w:right w:w="100" w:type="dxa"/>
+            </w:tcMar>
+          </w:tcPr>
+          <w:p>
+            <w:r>
+              <w:rPr>
+                <w:sz w:val="18"/>
+              </w:rPr>
+              <w:t>slots</w:t>
+            </w:r>
+          </w:p>
+        </w:tc>
+        <w:tc>
+          <w:tcPr>
+            <w:tcW w:type="dxa" w:w="1560"/>
+            <w:shd w:fill="F2F5F9"/>
+            <w:tcMar>
+              <w:top w:w="60" w:type="dxa"/>
+              <w:bottom w:w="60" w:type="dxa"/>
+              <w:left w:w="100" w:type="dxa"/>
+              <w:right w:w="100" w:type="dxa"/>
+            </w:tcMar>
+          </w:tcPr>
+          <w:p>
+            <w:r>
+              <w:rPr>
+                <w:sz w:val="18"/>
+              </w:rPr>
+              <w:t>3.000</w:t>
+            </w:r>
+          </w:p>
+        </w:tc>
+        <w:tc>
+          <w:tcPr>
+            <w:tcW w:type="dxa" w:w="1560"/>
+            <w:shd w:fill="F2F5F9"/>
+            <w:tcMar>
+              <w:top w:w="60" w:type="dxa"/>
+              <w:bottom w:w="60" w:type="dxa"/>
+              <w:left w:w="100" w:type="dxa"/>
+              <w:right w:w="100" w:type="dxa"/>
+            </w:tcMar>
+          </w:tcPr>
+          <w:p>
+            <w:r>
+              <w:rPr>
+                <w:sz w:val="18"/>
+              </w:rPr>
+              <w:t>Límite físico</w:t>
+            </w:r>
+          </w:p>
+        </w:tc>
+        <w:tc>
+          <w:tcPr>
+            <w:tcW w:type="dxa" w:w="1560"/>
+            <w:shd w:fill="F2F5F9"/>
+            <w:tcMar>
+              <w:top w:w="60" w:type="dxa"/>
+              <w:bottom w:w="60" w:type="dxa"/>
+              <w:left w:w="100" w:type="dxa"/>
+              <w:right w:w="100" w:type="dxa"/>
+            </w:tcMar>
+          </w:tcPr>
+          <w:p>
+            <w:r>
+              <w:rPr>
+                <w:sz w:val="18"/>
+              </w:rPr>
+              <w:t>Alerta congestión &gt; 2.250 slots (75%)</w:t>
+            </w:r>
+          </w:p>
+        </w:tc>
+      </w:tr>
+      <w:tr>
+        <w:tc>
+          <w:tcPr>
+            <w:tcW w:type="dxa" w:w="1560"/>
+            <w:tcMar>
+              <w:top w:w="60" w:type="dxa"/>
+              <w:bottom w:w="60" w:type="dxa"/>
+              <w:left w:w="100" w:type="dxa"/>
+              <w:right w:w="100" w:type="dxa"/>
+            </w:tcMar>
+          </w:tcPr>
+          <w:p>
+            <w:r>
+              <w:rPr>
+                <w:sz w:val="18"/>
+              </w:rPr>
+              <w:t>T_dwell</w:t>
+            </w:r>
+          </w:p>
+        </w:tc>
+        <w:tc>
+          <w:tcPr>
+            <w:tcW w:type="dxa" w:w="1560"/>
+            <w:tcMar>
+              <w:top w:w="60" w:type="dxa"/>
+              <w:bottom w:w="60" w:type="dxa"/>
+              <w:left w:w="100" w:type="dxa"/>
+              <w:right w:w="100" w:type="dxa"/>
+            </w:tcMar>
+          </w:tcPr>
+          <w:p>
+            <w:r>
+              <w:rPr>
+                <w:sz w:val="18"/>
+              </w:rPr>
+              <w:t>Permanencia en patio</w:t>
+            </w:r>
+          </w:p>
+        </w:tc>
+        <w:tc>
+          <w:tcPr>
+            <w:tcW w:type="dxa" w:w="1560"/>
+            <w:tcMar>
+              <w:top w:w="60" w:type="dxa"/>
+              <w:bottom w:w="60" w:type="dxa"/>
+              <w:left w:w="100" w:type="dxa"/>
+              <w:right w:w="100" w:type="dxa"/>
+            </w:tcMar>
+          </w:tcPr>
+          <w:p>
+            <w:r>
+              <w:rPr>
+                <w:sz w:val="18"/>
+              </w:rPr>
+              <w:t>horas</w:t>
+            </w:r>
+          </w:p>
+        </w:tc>
+        <w:tc>
+          <w:tcPr>
+            <w:tcW w:type="dxa" w:w="1560"/>
+            <w:tcMar>
+              <w:top w:w="60" w:type="dxa"/>
+              <w:bottom w:w="60" w:type="dxa"/>
+              <w:left w:w="100" w:type="dxa"/>
+              <w:right w:w="100" w:type="dxa"/>
+            </w:tcMar>
+          </w:tcPr>
+          <w:p>
+            <w:r>
+              <w:rPr>
+                <w:sz w:val="18"/>
+              </w:rPr>
+              <w:t>72</w:t>
+            </w:r>
+          </w:p>
+        </w:tc>
+        <w:tc>
+          <w:tcPr>
+            <w:tcW w:type="dxa" w:w="1560"/>
+            <w:tcMar>
+              <w:top w:w="60" w:type="dxa"/>
+              <w:bottom w:w="60" w:type="dxa"/>
+              <w:left w:w="100" w:type="dxa"/>
+              <w:right w:w="100" w:type="dxa"/>
+            </w:tcMar>
+          </w:tcPr>
+          <w:p>
+            <w:r>
+              <w:rPr>
+                <w:sz w:val="18"/>
+              </w:rPr>
+              <w:t>Almacenaje en tierra</w:t>
+            </w:r>
+          </w:p>
+        </w:tc>
+        <w:tc>
+          <w:tcPr>
+            <w:tcW w:type="dxa" w:w="1560"/>
+            <w:tcMar>
+              <w:top w:w="60" w:type="dxa"/>
+              <w:bottom w:w="60" w:type="dxa"/>
+              <w:left w:w="100" w:type="dxa"/>
+              <w:right w:w="100" w:type="dxa"/>
+            </w:tcMar>
+          </w:tcPr>
+          <w:p>
+            <w:r>
+              <w:rPr>
+                <w:sz w:val="18"/>
+              </w:rPr>
+              <w:t>Exponencial (media = 72h)</w:t>
+            </w:r>
+          </w:p>
+        </w:tc>
+      </w:tr>
+    </w:tbl>
+    <w:p>
       <w:pPr>
         <w:pStyle w:val="Heading1"/>
       </w:pPr>
@@ -539,6 +1993,895 @@
         <w:t>El protocolo estadístico incluye eliminación del período de calentamiento, réplicas independientes, ANOVA y Test de Comparaciones Múltiples de Tukey HSD (FWER = 0.05).</w:t>
       </w:r>
     </w:p>
+    <w:p>
+      <w:r>
+        <w:rPr>
+          <w:b/>
+        </w:rPr>
+        <w:t>3.2. Plan de Cuadros y Matriz de Resultados (Diapositiva 15):</w:t>
+      </w:r>
+    </w:p>
+    <w:tbl>
+      <w:tblPr>
+        <w:tblW w:type="auto" w:w="0"/>
+        <w:jc w:val="center"/>
+        <w:tblLook w:firstColumn="1" w:firstRow="1" w:lastColumn="0" w:lastRow="0" w:noHBand="0" w:noVBand="1" w:val="04A0"/>
+      </w:tblPr>
+      <w:tblGrid>
+        <w:gridCol w:w="1560"/>
+        <w:gridCol w:w="1560"/>
+        <w:gridCol w:w="1560"/>
+        <w:gridCol w:w="1560"/>
+        <w:gridCol w:w="1560"/>
+        <w:gridCol w:w="1560"/>
+      </w:tblGrid>
+      <w:tr>
+        <w:tc>
+          <w:tcPr>
+            <w:tcW w:type="dxa" w:w="1560"/>
+            <w:shd w:fill="2F5597"/>
+            <w:tcMar>
+              <w:top w:w="100" w:type="dxa"/>
+              <w:bottom w:w="100" w:type="dxa"/>
+              <w:left w:w="120" w:type="dxa"/>
+              <w:right w:w="120" w:type="dxa"/>
+            </w:tcMar>
+          </w:tcPr>
+          <w:p>
+            <w:pPr>
+              <w:jc w:val="center"/>
+            </w:pPr>
+            <w:r>
+              <w:rPr>
+                <w:b/>
+                <w:color w:val="FFFFFF"/>
+                <w:sz w:val="19"/>
+              </w:rPr>
+              <w:t>Escenario Evaluado</w:t>
+            </w:r>
+          </w:p>
+        </w:tc>
+        <w:tc>
+          <w:tcPr>
+            <w:tcW w:type="dxa" w:w="1560"/>
+            <w:shd w:fill="2F5597"/>
+            <w:tcMar>
+              <w:top w:w="100" w:type="dxa"/>
+              <w:bottom w:w="100" w:type="dxa"/>
+              <w:left w:w="120" w:type="dxa"/>
+              <w:right w:w="120" w:type="dxa"/>
+            </w:tcMar>
+          </w:tcPr>
+          <w:p>
+            <w:pPr>
+              <w:jc w:val="center"/>
+            </w:pPr>
+            <w:r>
+              <w:rPr>
+                <w:b/>
+                <w:color w:val="FFFFFF"/>
+                <w:sz w:val="19"/>
+              </w:rPr>
+              <w:t>Variables Control</w:t>
+            </w:r>
+          </w:p>
+        </w:tc>
+        <w:tc>
+          <w:tcPr>
+            <w:tcW w:type="dxa" w:w="1560"/>
+            <w:shd w:fill="2F5597"/>
+            <w:tcMar>
+              <w:top w:w="100" w:type="dxa"/>
+              <w:bottom w:w="100" w:type="dxa"/>
+              <w:left w:w="120" w:type="dxa"/>
+              <w:right w:w="120" w:type="dxa"/>
+            </w:tcMar>
+          </w:tcPr>
+          <w:p>
+            <w:pPr>
+              <w:jc w:val="center"/>
+            </w:pPr>
+            <w:r>
+              <w:rPr>
+                <w:b/>
+                <w:color w:val="FFFFFF"/>
+                <w:sz w:val="19"/>
+              </w:rPr>
+              <w:t>W [h] (Media +- IC 95%)</w:t>
+            </w:r>
+          </w:p>
+        </w:tc>
+        <w:tc>
+          <w:tcPr>
+            <w:tcW w:type="dxa" w:w="1560"/>
+            <w:shd w:fill="2F5597"/>
+            <w:tcMar>
+              <w:top w:w="100" w:type="dxa"/>
+              <w:bottom w:w="100" w:type="dxa"/>
+              <w:left w:w="120" w:type="dxa"/>
+              <w:right w:w="120" w:type="dxa"/>
+            </w:tcMar>
+          </w:tcPr>
+          <w:p>
+            <w:pPr>
+              <w:jc w:val="center"/>
+            </w:pPr>
+            <w:r>
+              <w:rPr>
+                <w:b/>
+                <w:color w:val="FFFFFF"/>
+                <w:sz w:val="19"/>
+              </w:rPr>
+              <w:t>Wq [h] (Espera)</w:t>
+            </w:r>
+          </w:p>
+        </w:tc>
+        <w:tc>
+          <w:tcPr>
+            <w:tcW w:type="dxa" w:w="1560"/>
+            <w:shd w:fill="2F5597"/>
+            <w:tcMar>
+              <w:top w:w="100" w:type="dxa"/>
+              <w:bottom w:w="100" w:type="dxa"/>
+              <w:left w:w="120" w:type="dxa"/>
+              <w:right w:w="120" w:type="dxa"/>
+            </w:tcMar>
+          </w:tcPr>
+          <w:p>
+            <w:pPr>
+              <w:jc w:val="center"/>
+            </w:pPr>
+            <w:r>
+              <w:rPr>
+                <w:b/>
+                <w:color w:val="FFFFFF"/>
+                <w:sz w:val="19"/>
+              </w:rPr>
+              <w:t>Nivel Servicio P(W&lt;=16h)</w:t>
+            </w:r>
+          </w:p>
+        </w:tc>
+        <w:tc>
+          <w:tcPr>
+            <w:tcW w:type="dxa" w:w="1560"/>
+            <w:shd w:fill="2F5597"/>
+            <w:tcMar>
+              <w:top w:w="100" w:type="dxa"/>
+              <w:bottom w:w="100" w:type="dxa"/>
+              <w:left w:w="120" w:type="dxa"/>
+              <w:right w:w="120" w:type="dxa"/>
+            </w:tcMar>
+          </w:tcPr>
+          <w:p>
+            <w:pPr>
+              <w:jc w:val="center"/>
+            </w:pPr>
+            <w:r>
+              <w:rPr>
+                <w:b/>
+                <w:color w:val="FFFFFF"/>
+                <w:sz w:val="19"/>
+              </w:rPr>
+              <w:t>Decisión / Conclusión</w:t>
+            </w:r>
+          </w:p>
+        </w:tc>
+      </w:tr>
+      <w:tr>
+        <w:tc>
+          <w:tcPr>
+            <w:tcW w:type="dxa" w:w="1560"/>
+            <w:shd w:fill="F2F5F9"/>
+            <w:tcMar>
+              <w:top w:w="60" w:type="dxa"/>
+              <w:bottom w:w="60" w:type="dxa"/>
+              <w:left w:w="100" w:type="dxa"/>
+              <w:right w:w="100" w:type="dxa"/>
+            </w:tcMar>
+          </w:tcPr>
+          <w:p>
+            <w:r>
+              <w:rPr>
+                <w:sz w:val="18"/>
+              </w:rPr>
+              <w:t>Escenario Base (Inciso b)</w:t>
+            </w:r>
+          </w:p>
+        </w:tc>
+        <w:tc>
+          <w:tcPr>
+            <w:tcW w:type="dxa" w:w="1560"/>
+            <w:shd w:fill="F2F5F9"/>
+            <w:tcMar>
+              <w:top w:w="60" w:type="dxa"/>
+              <w:bottom w:w="60" w:type="dxa"/>
+              <w:left w:w="100" w:type="dxa"/>
+              <w:right w:w="100" w:type="dxa"/>
+            </w:tcMar>
+          </w:tcPr>
+          <w:p>
+            <w:r>
+              <w:rPr>
+                <w:sz w:val="18"/>
+              </w:rPr>
+              <w:t>B=3, G=3, Pi_std, 1G_noc</w:t>
+            </w:r>
+          </w:p>
+        </w:tc>
+        <w:tc>
+          <w:tcPr>
+            <w:tcW w:type="dxa" w:w="1560"/>
+            <w:shd w:fill="F2F5F9"/>
+            <w:tcMar>
+              <w:top w:w="60" w:type="dxa"/>
+              <w:bottom w:w="60" w:type="dxa"/>
+              <w:left w:w="100" w:type="dxa"/>
+              <w:right w:w="100" w:type="dxa"/>
+            </w:tcMar>
+          </w:tcPr>
+          <w:p>
+            <w:r>
+              <w:rPr>
+                <w:sz w:val="18"/>
+              </w:rPr>
+              <w:t>W_base +- Delta W</w:t>
+            </w:r>
+          </w:p>
+        </w:tc>
+        <w:tc>
+          <w:tcPr>
+            <w:tcW w:type="dxa" w:w="1560"/>
+            <w:shd w:fill="F2F5F9"/>
+            <w:tcMar>
+              <w:top w:w="60" w:type="dxa"/>
+              <w:bottom w:w="60" w:type="dxa"/>
+              <w:left w:w="100" w:type="dxa"/>
+              <w:right w:w="100" w:type="dxa"/>
+            </w:tcMar>
+          </w:tcPr>
+          <w:p>
+            <w:r>
+              <w:rPr>
+                <w:sz w:val="18"/>
+              </w:rPr>
+              <w:t>Wq_base</w:t>
+            </w:r>
+          </w:p>
+        </w:tc>
+        <w:tc>
+          <w:tcPr>
+            <w:tcW w:type="dxa" w:w="1560"/>
+            <w:shd w:fill="F2F5F9"/>
+            <w:tcMar>
+              <w:top w:w="60" w:type="dxa"/>
+              <w:bottom w:w="60" w:type="dxa"/>
+              <w:left w:w="100" w:type="dxa"/>
+              <w:right w:w="100" w:type="dxa"/>
+            </w:tcMar>
+          </w:tcPr>
+          <w:p>
+            <w:r>
+              <w:rPr>
+                <w:sz w:val="18"/>
+              </w:rPr>
+              <w:t>NS_base</w:t>
+            </w:r>
+          </w:p>
+        </w:tc>
+        <w:tc>
+          <w:tcPr>
+            <w:tcW w:type="dxa" w:w="1560"/>
+            <w:shd w:fill="F2F5F9"/>
+            <w:tcMar>
+              <w:top w:w="60" w:type="dxa"/>
+              <w:bottom w:w="60" w:type="dxa"/>
+              <w:left w:w="100" w:type="dxa"/>
+              <w:right w:w="100" w:type="dxa"/>
+            </w:tcMar>
+          </w:tcPr>
+          <w:p>
+            <w:r>
+              <w:rPr>
+                <w:sz w:val="18"/>
+              </w:rPr>
+              <w:t>Diagnóstico situación actual</w:t>
+            </w:r>
+          </w:p>
+        </w:tc>
+      </w:tr>
+      <w:tr>
+        <w:tc>
+          <w:tcPr>
+            <w:tcW w:type="dxa" w:w="1560"/>
+            <w:tcMar>
+              <w:top w:w="60" w:type="dxa"/>
+              <w:bottom w:w="60" w:type="dxa"/>
+              <w:left w:w="100" w:type="dxa"/>
+              <w:right w:w="100" w:type="dxa"/>
+            </w:tcMar>
+          </w:tcPr>
+          <w:p>
+            <w:r>
+              <w:rPr>
+                <w:sz w:val="18"/>
+              </w:rPr>
+              <w:t>Escenario Capacidad (Inciso c)</w:t>
+            </w:r>
+          </w:p>
+        </w:tc>
+        <w:tc>
+          <w:tcPr>
+            <w:tcW w:type="dxa" w:w="1560"/>
+            <w:tcMar>
+              <w:top w:w="60" w:type="dxa"/>
+              <w:bottom w:w="60" w:type="dxa"/>
+              <w:left w:w="100" w:type="dxa"/>
+              <w:right w:w="100" w:type="dxa"/>
+            </w:tcMar>
+          </w:tcPr>
+          <w:p>
+            <w:r>
+              <w:rPr>
+                <w:sz w:val="18"/>
+              </w:rPr>
+              <w:t>B=3, G=4 vs lambda barrido</w:t>
+            </w:r>
+          </w:p>
+        </w:tc>
+        <w:tc>
+          <w:tcPr>
+            <w:tcW w:type="dxa" w:w="1560"/>
+            <w:tcMar>
+              <w:top w:w="60" w:type="dxa"/>
+              <w:bottom w:w="60" w:type="dxa"/>
+              <w:left w:w="100" w:type="dxa"/>
+              <w:right w:w="100" w:type="dxa"/>
+            </w:tcMar>
+          </w:tcPr>
+          <w:p>
+            <w:r>
+              <w:rPr>
+                <w:sz w:val="18"/>
+              </w:rPr>
+              <w:t>W_cap +- Delta W</w:t>
+            </w:r>
+          </w:p>
+        </w:tc>
+        <w:tc>
+          <w:tcPr>
+            <w:tcW w:type="dxa" w:w="1560"/>
+            <w:tcMar>
+              <w:top w:w="60" w:type="dxa"/>
+              <w:bottom w:w="60" w:type="dxa"/>
+              <w:left w:w="100" w:type="dxa"/>
+              <w:right w:w="100" w:type="dxa"/>
+            </w:tcMar>
+          </w:tcPr>
+          <w:p>
+            <w:r>
+              <w:rPr>
+                <w:sz w:val="18"/>
+              </w:rPr>
+              <w:t>Wq_cap</w:t>
+            </w:r>
+          </w:p>
+        </w:tc>
+        <w:tc>
+          <w:tcPr>
+            <w:tcW w:type="dxa" w:w="1560"/>
+            <w:tcMar>
+              <w:top w:w="60" w:type="dxa"/>
+              <w:bottom w:w="60" w:type="dxa"/>
+              <w:left w:w="100" w:type="dxa"/>
+              <w:right w:w="100" w:type="dxa"/>
+            </w:tcMar>
+          </w:tcPr>
+          <w:p>
+            <w:r>
+              <w:rPr>
+                <w:sz w:val="18"/>
+              </w:rPr>
+              <w:t>NS_cap</w:t>
+            </w:r>
+          </w:p>
+        </w:tc>
+        <w:tc>
+          <w:tcPr>
+            <w:tcW w:type="dxa" w:w="1560"/>
+            <w:tcMar>
+              <w:top w:w="60" w:type="dxa"/>
+              <w:bottom w:w="60" w:type="dxa"/>
+              <w:left w:w="100" w:type="dxa"/>
+              <w:right w:w="100" w:type="dxa"/>
+            </w:tcMar>
+          </w:tcPr>
+          <w:p>
+            <w:r>
+              <w:rPr>
+                <w:sz w:val="18"/>
+              </w:rPr>
+              <w:t>Límite máx. buques/día con W &lt;= 16h</w:t>
+            </w:r>
+          </w:p>
+        </w:tc>
+      </w:tr>
+      <w:tr>
+        <w:tc>
+          <w:tcPr>
+            <w:tcW w:type="dxa" w:w="1560"/>
+            <w:shd w:fill="F2F5F9"/>
+            <w:tcMar>
+              <w:top w:w="60" w:type="dxa"/>
+              <w:bottom w:w="60" w:type="dxa"/>
+              <w:left w:w="100" w:type="dxa"/>
+              <w:right w:w="100" w:type="dxa"/>
+            </w:tcMar>
+          </w:tcPr>
+          <w:p>
+            <w:r>
+              <w:rPr>
+                <w:sz w:val="18"/>
+              </w:rPr>
+              <w:t>Escenario Patio (Inciso d)</w:t>
+            </w:r>
+          </w:p>
+        </w:tc>
+        <w:tc>
+          <w:tcPr>
+            <w:tcW w:type="dxa" w:w="1560"/>
+            <w:shd w:fill="F2F5F9"/>
+            <w:tcMar>
+              <w:top w:w="60" w:type="dxa"/>
+              <w:bottom w:w="60" w:type="dxa"/>
+              <w:left w:w="100" w:type="dxa"/>
+              <w:right w:w="100" w:type="dxa"/>
+            </w:tcMar>
+          </w:tcPr>
+          <w:p>
+            <w:r>
+              <w:rPr>
+                <w:sz w:val="18"/>
+              </w:rPr>
+              <w:t>Pi_cam in {Multa, Ventana}</w:t>
+            </w:r>
+          </w:p>
+        </w:tc>
+        <w:tc>
+          <w:tcPr>
+            <w:tcW w:type="dxa" w:w="1560"/>
+            <w:shd w:fill="F2F5F9"/>
+            <w:tcMar>
+              <w:top w:w="60" w:type="dxa"/>
+              <w:bottom w:w="60" w:type="dxa"/>
+              <w:left w:w="100" w:type="dxa"/>
+              <w:right w:w="100" w:type="dxa"/>
+            </w:tcMar>
+          </w:tcPr>
+          <w:p>
+            <w:r>
+              <w:rPr>
+                <w:sz w:val="18"/>
+              </w:rPr>
+              <w:t>W_pat +- Delta W</w:t>
+            </w:r>
+          </w:p>
+        </w:tc>
+        <w:tc>
+          <w:tcPr>
+            <w:tcW w:type="dxa" w:w="1560"/>
+            <w:shd w:fill="F2F5F9"/>
+            <w:tcMar>
+              <w:top w:w="60" w:type="dxa"/>
+              <w:bottom w:w="60" w:type="dxa"/>
+              <w:left w:w="100" w:type="dxa"/>
+              <w:right w:w="100" w:type="dxa"/>
+            </w:tcMar>
+          </w:tcPr>
+          <w:p>
+            <w:r>
+              <w:rPr>
+                <w:sz w:val="18"/>
+              </w:rPr>
+              <w:t>Wq_pat</w:t>
+            </w:r>
+          </w:p>
+        </w:tc>
+        <w:tc>
+          <w:tcPr>
+            <w:tcW w:type="dxa" w:w="1560"/>
+            <w:shd w:fill="F2F5F9"/>
+            <w:tcMar>
+              <w:top w:w="60" w:type="dxa"/>
+              <w:bottom w:w="60" w:type="dxa"/>
+              <w:left w:w="100" w:type="dxa"/>
+              <w:right w:w="100" w:type="dxa"/>
+            </w:tcMar>
+          </w:tcPr>
+          <w:p>
+            <w:r>
+              <w:rPr>
+                <w:sz w:val="18"/>
+              </w:rPr>
+              <w:t>NS_pat</w:t>
+            </w:r>
+          </w:p>
+        </w:tc>
+        <w:tc>
+          <w:tcPr>
+            <w:tcW w:type="dxa" w:w="1560"/>
+            <w:shd w:fill="F2F5F9"/>
+            <w:tcMar>
+              <w:top w:w="60" w:type="dxa"/>
+              <w:bottom w:w="60" w:type="dxa"/>
+              <w:left w:w="100" w:type="dxa"/>
+              <w:right w:w="100" w:type="dxa"/>
+            </w:tcMar>
+          </w:tcPr>
+          <w:p>
+            <w:r>
+              <w:rPr>
+                <w:sz w:val="18"/>
+              </w:rPr>
+              <w:t>Descongestión patio &lt; 75%</w:t>
+            </w:r>
+          </w:p>
+        </w:tc>
+      </w:tr>
+      <w:tr>
+        <w:tc>
+          <w:tcPr>
+            <w:tcW w:type="dxa" w:w="1560"/>
+            <w:tcMar>
+              <w:top w:w="60" w:type="dxa"/>
+              <w:bottom w:w="60" w:type="dxa"/>
+              <w:left w:w="100" w:type="dxa"/>
+              <w:right w:w="100" w:type="dxa"/>
+            </w:tcMar>
+          </w:tcPr>
+          <w:p>
+            <w:r>
+              <w:rPr>
+                <w:sz w:val="18"/>
+              </w:rPr>
+              <w:t>Escenario Cruceros (Inciso e)</w:t>
+            </w:r>
+          </w:p>
+        </w:tc>
+        <w:tc>
+          <w:tcPr>
+            <w:tcW w:type="dxa" w:w="1560"/>
+            <w:tcMar>
+              <w:top w:w="60" w:type="dxa"/>
+              <w:bottom w:w="60" w:type="dxa"/>
+              <w:left w:w="100" w:type="dxa"/>
+              <w:right w:w="100" w:type="dxa"/>
+            </w:tcMar>
+          </w:tcPr>
+          <w:p>
+            <w:r>
+              <w:rPr>
+                <w:sz w:val="18"/>
+              </w:rPr>
+              <w:t>Cede 1 Berma (B=2 carga)</w:t>
+            </w:r>
+          </w:p>
+        </w:tc>
+        <w:tc>
+          <w:tcPr>
+            <w:tcW w:type="dxa" w:w="1560"/>
+            <w:tcMar>
+              <w:top w:w="60" w:type="dxa"/>
+              <w:bottom w:w="60" w:type="dxa"/>
+              <w:left w:w="100" w:type="dxa"/>
+              <w:right w:w="100" w:type="dxa"/>
+            </w:tcMar>
+          </w:tcPr>
+          <w:p>
+            <w:r>
+              <w:rPr>
+                <w:sz w:val="18"/>
+              </w:rPr>
+              <w:t>W_cruc +- Delta W</w:t>
+            </w:r>
+          </w:p>
+        </w:tc>
+        <w:tc>
+          <w:tcPr>
+            <w:tcW w:type="dxa" w:w="1560"/>
+            <w:tcMar>
+              <w:top w:w="60" w:type="dxa"/>
+              <w:bottom w:w="60" w:type="dxa"/>
+              <w:left w:w="100" w:type="dxa"/>
+              <w:right w:w="100" w:type="dxa"/>
+            </w:tcMar>
+          </w:tcPr>
+          <w:p>
+            <w:r>
+              <w:rPr>
+                <w:sz w:val="18"/>
+              </w:rPr>
+              <w:t>Wq_cruc</w:t>
+            </w:r>
+          </w:p>
+        </w:tc>
+        <w:tc>
+          <w:tcPr>
+            <w:tcW w:type="dxa" w:w="1560"/>
+            <w:tcMar>
+              <w:top w:w="60" w:type="dxa"/>
+              <w:bottom w:w="60" w:type="dxa"/>
+              <w:left w:w="100" w:type="dxa"/>
+              <w:right w:w="100" w:type="dxa"/>
+            </w:tcMar>
+          </w:tcPr>
+          <w:p>
+            <w:r>
+              <w:rPr>
+                <w:sz w:val="18"/>
+              </w:rPr>
+              <w:t>NS_cruc</w:t>
+            </w:r>
+          </w:p>
+        </w:tc>
+        <w:tc>
+          <w:tcPr>
+            <w:tcW w:type="dxa" w:w="1560"/>
+            <w:tcMar>
+              <w:top w:w="60" w:type="dxa"/>
+              <w:bottom w:w="60" w:type="dxa"/>
+              <w:left w:w="100" w:type="dxa"/>
+              <w:right w:w="100" w:type="dxa"/>
+            </w:tcMar>
+          </w:tcPr>
+          <w:p>
+            <w:r>
+              <w:rPr>
+                <w:sz w:val="18"/>
+              </w:rPr>
+              <w:t>Impacto inmovilización vs USD 60k</w:t>
+            </w:r>
+          </w:p>
+        </w:tc>
+      </w:tr>
+      <w:tr>
+        <w:tc>
+          <w:tcPr>
+            <w:tcW w:type="dxa" w:w="1560"/>
+            <w:shd w:fill="F2F5F9"/>
+            <w:tcMar>
+              <w:top w:w="60" w:type="dxa"/>
+              <w:bottom w:w="60" w:type="dxa"/>
+              <w:left w:w="100" w:type="dxa"/>
+              <w:right w:w="100" w:type="dxa"/>
+            </w:tcMar>
+          </w:tcPr>
+          <w:p>
+            <w:r>
+              <w:rPr>
+                <w:sz w:val="18"/>
+              </w:rPr>
+              <w:t>Escenario Industrial (Inciso f)</w:t>
+            </w:r>
+          </w:p>
+        </w:tc>
+        <w:tc>
+          <w:tcPr>
+            <w:tcW w:type="dxa" w:w="1560"/>
+            <w:shd w:fill="F2F5F9"/>
+            <w:tcMar>
+              <w:top w:w="60" w:type="dxa"/>
+              <w:bottom w:w="60" w:type="dxa"/>
+              <w:left w:w="100" w:type="dxa"/>
+              <w:right w:w="100" w:type="dxa"/>
+            </w:tcMar>
+          </w:tcPr>
+          <w:p>
+            <w:r>
+              <w:rPr>
+                <w:sz w:val="18"/>
+              </w:rPr>
+              <w:t>lambda +35% y +100%</w:t>
+            </w:r>
+          </w:p>
+        </w:tc>
+        <w:tc>
+          <w:tcPr>
+            <w:tcW w:type="dxa" w:w="1560"/>
+            <w:shd w:fill="F2F5F9"/>
+            <w:tcMar>
+              <w:top w:w="60" w:type="dxa"/>
+              <w:bottom w:w="60" w:type="dxa"/>
+              <w:left w:w="100" w:type="dxa"/>
+              <w:right w:w="100" w:type="dxa"/>
+            </w:tcMar>
+          </w:tcPr>
+          <w:p>
+            <w:r>
+              <w:rPr>
+                <w:sz w:val="18"/>
+              </w:rPr>
+              <w:t>W_ind +- Delta W</w:t>
+            </w:r>
+          </w:p>
+        </w:tc>
+        <w:tc>
+          <w:tcPr>
+            <w:tcW w:type="dxa" w:w="1560"/>
+            <w:shd w:fill="F2F5F9"/>
+            <w:tcMar>
+              <w:top w:w="60" w:type="dxa"/>
+              <w:bottom w:w="60" w:type="dxa"/>
+              <w:left w:w="100" w:type="dxa"/>
+              <w:right w:w="100" w:type="dxa"/>
+            </w:tcMar>
+          </w:tcPr>
+          <w:p>
+            <w:r>
+              <w:rPr>
+                <w:sz w:val="18"/>
+              </w:rPr>
+              <w:t>Wq_ind</w:t>
+            </w:r>
+          </w:p>
+        </w:tc>
+        <w:tc>
+          <w:tcPr>
+            <w:tcW w:type="dxa" w:w="1560"/>
+            <w:shd w:fill="F2F5F9"/>
+            <w:tcMar>
+              <w:top w:w="60" w:type="dxa"/>
+              <w:bottom w:w="60" w:type="dxa"/>
+              <w:left w:w="100" w:type="dxa"/>
+              <w:right w:w="100" w:type="dxa"/>
+            </w:tcMar>
+          </w:tcPr>
+          <w:p>
+            <w:r>
+              <w:rPr>
+                <w:sz w:val="18"/>
+              </w:rPr>
+              <w:t>NS_ind</w:t>
+            </w:r>
+          </w:p>
+        </w:tc>
+        <w:tc>
+          <w:tcPr>
+            <w:tcW w:type="dxa" w:w="1560"/>
+            <w:shd w:fill="F2F5F9"/>
+            <w:tcMar>
+              <w:top w:w="60" w:type="dxa"/>
+              <w:bottom w:w="60" w:type="dxa"/>
+              <w:left w:w="100" w:type="dxa"/>
+              <w:right w:w="100" w:type="dxa"/>
+            </w:tcMar>
+          </w:tcPr>
+          <w:p>
+            <w:r>
+              <w:rPr>
+                <w:sz w:val="18"/>
+              </w:rPr>
+              <w:t>Matrices bajo incertidumbre</w:t>
+            </w:r>
+          </w:p>
+        </w:tc>
+      </w:tr>
+      <w:tr>
+        <w:tc>
+          <w:tcPr>
+            <w:tcW w:type="dxa" w:w="1560"/>
+            <w:tcMar>
+              <w:top w:w="60" w:type="dxa"/>
+              <w:bottom w:w="60" w:type="dxa"/>
+              <w:left w:w="100" w:type="dxa"/>
+              <w:right w:w="100" w:type="dxa"/>
+            </w:tcMar>
+          </w:tcPr>
+          <w:p>
+            <w:r>
+              <w:rPr>
+                <w:sz w:val="18"/>
+              </w:rPr>
+              <w:t>Escenario Payback (Inciso g)</w:t>
+            </w:r>
+          </w:p>
+        </w:tc>
+        <w:tc>
+          <w:tcPr>
+            <w:tcW w:type="dxa" w:w="1560"/>
+            <w:tcMar>
+              <w:top w:w="60" w:type="dxa"/>
+              <w:bottom w:w="60" w:type="dxa"/>
+              <w:left w:w="100" w:type="dxa"/>
+              <w:right w:w="100" w:type="dxa"/>
+            </w:tcMar>
+          </w:tcPr>
+          <w:p>
+            <w:r>
+              <w:rPr>
+                <w:sz w:val="18"/>
+              </w:rPr>
+              <w:t>Expansión 4ª Berma (B=4)</w:t>
+            </w:r>
+          </w:p>
+        </w:tc>
+        <w:tc>
+          <w:tcPr>
+            <w:tcW w:type="dxa" w:w="1560"/>
+            <w:tcMar>
+              <w:top w:w="60" w:type="dxa"/>
+              <w:bottom w:w="60" w:type="dxa"/>
+              <w:left w:w="100" w:type="dxa"/>
+              <w:right w:w="100" w:type="dxa"/>
+            </w:tcMar>
+          </w:tcPr>
+          <w:p>
+            <w:r>
+              <w:rPr>
+                <w:sz w:val="18"/>
+              </w:rPr>
+              <w:t>W_inv +- Delta W</w:t>
+            </w:r>
+          </w:p>
+        </w:tc>
+        <w:tc>
+          <w:tcPr>
+            <w:tcW w:type="dxa" w:w="1560"/>
+            <w:tcMar>
+              <w:top w:w="60" w:type="dxa"/>
+              <w:bottom w:w="60" w:type="dxa"/>
+              <w:left w:w="100" w:type="dxa"/>
+              <w:right w:w="100" w:type="dxa"/>
+            </w:tcMar>
+          </w:tcPr>
+          <w:p>
+            <w:r>
+              <w:rPr>
+                <w:sz w:val="18"/>
+              </w:rPr>
+              <w:t>Wq_inv</w:t>
+            </w:r>
+          </w:p>
+        </w:tc>
+        <w:tc>
+          <w:tcPr>
+            <w:tcW w:type="dxa" w:w="1560"/>
+            <w:tcMar>
+              <w:top w:w="60" w:type="dxa"/>
+              <w:bottom w:w="60" w:type="dxa"/>
+              <w:left w:w="100" w:type="dxa"/>
+              <w:right w:w="100" w:type="dxa"/>
+            </w:tcMar>
+          </w:tcPr>
+          <w:p>
+            <w:r>
+              <w:rPr>
+                <w:sz w:val="18"/>
+              </w:rPr>
+              <w:t>NS_inv</w:t>
+            </w:r>
+          </w:p>
+        </w:tc>
+        <w:tc>
+          <w:tcPr>
+            <w:tcW w:type="dxa" w:w="1560"/>
+            <w:tcMar>
+              <w:top w:w="60" w:type="dxa"/>
+              <w:bottom w:w="60" w:type="dxa"/>
+              <w:left w:w="100" w:type="dxa"/>
+              <w:right w:w="100" w:type="dxa"/>
+            </w:tcMar>
+          </w:tcPr>
+          <w:p>
+            <w:r>
+              <w:rPr>
+                <w:sz w:val="18"/>
+              </w:rPr>
+              <w:t>Repago inversión USD 12M</w:t>
+            </w:r>
+          </w:p>
+        </w:tc>
+      </w:tr>
+    </w:tbl>
     <w:p>
       <w:pPr>
         <w:pStyle w:val="Heading1"/>

</xml_diff>